<commit_message>
Restyle CV for faster recruiter scanning
Keep all core experience and wording. Add a navy-and-gold header,
at-a-glance highlight cards, skill tiles, and clearer section bars
so the CV is easier to read in a few seconds.

Co-authored-by: jaseerkp11 <jaseerkp11@users.noreply.github.com>
</commit_message>
<xml_diff>
--- a/cv/Mohammed_Jaseer_CV_ATS.docx
+++ b/cv/Mohammed_Jaseer_CV_ATS.docx
@@ -6,27 +6,29 @@
       <w:pPr>
         <w:spacing w:before="0" w:after="40" w:line="240" w:lineRule="auto"/>
         <w:jc w:val="center"/>
+        <w:shd w:val="clear" w:color="auto" w:fill="0F2C3C"/>
       </w:pPr>
       <w:r>
         <w:rPr>
           <w:rFonts w:ascii="Calibri" w:hAnsi="Calibri" w:eastAsia="Calibri"/>
           <w:b/>
-          <w:color w:val="1B3A4B"/>
-          <w:sz w:val="40"/>
+          <w:color w:val="FFFFFF"/>
+          <w:sz w:val="44"/>
         </w:rPr>
         <w:t>MOHAMMED JASEER</w:t>
       </w:r>
     </w:p>
     <w:p>
       <w:pPr>
-        <w:spacing w:before="0" w:after="80" w:line="230" w:lineRule="auto"/>
+        <w:spacing w:before="0" w:after="40" w:line="230" w:lineRule="auto"/>
         <w:jc w:val="center"/>
+        <w:shd w:val="clear" w:color="auto" w:fill="0F2C3C"/>
       </w:pPr>
       <w:r>
         <w:rPr>
           <w:rFonts w:ascii="Calibri" w:hAnsi="Calibri" w:eastAsia="Calibri"/>
           <w:b/>
-          <w:color w:val="2C5F7C"/>
+          <w:color w:val="C4A35A"/>
           <w:sz w:val="22"/>
         </w:rPr>
         <w:t>Accounting  |  Finance  |  Operations  |  Procurement  |  Project Coordination</w:t>
@@ -34,13 +36,15 @@
     </w:p>
     <w:p>
       <w:pPr>
-        <w:spacing w:before="0" w:after="20" w:line="220" w:lineRule="auto"/>
+        <w:spacing w:before="0" w:after="0" w:line="220" w:lineRule="auto"/>
         <w:jc w:val="center"/>
+        <w:shd w:val="clear" w:color="auto" w:fill="17384A"/>
       </w:pPr>
       <w:r>
         <w:rPr>
           <w:rFonts w:ascii="Calibri" w:hAnsi="Calibri" w:eastAsia="Calibri"/>
           <w:b w:val="0"/>
+          <w:color w:val="FFFFFF"/>
           <w:sz w:val="20"/>
         </w:rPr>
         <w:t>Currently in India  |  Available for UAE Relocation  |  UAE Residence Visa valid until December 2027</w:t>
@@ -48,13 +52,15 @@
     </w:p>
     <w:p>
       <w:pPr>
-        <w:spacing w:before="0" w:after="40" w:line="220" w:lineRule="auto"/>
+        <w:spacing w:before="0" w:after="160" w:line="220" w:lineRule="auto"/>
         <w:jc w:val="center"/>
+        <w:shd w:val="clear" w:color="auto" w:fill="17384A"/>
       </w:pPr>
       <w:r>
         <w:rPr>
           <w:rFonts w:ascii="Calibri" w:hAnsi="Calibri" w:eastAsia="Calibri"/>
           <w:b w:val="0"/>
+          <w:color w:val="FFFFFF"/>
           <w:sz w:val="21"/>
         </w:rPr>
         <w:t>+971 56 454 9259  |  mohammedjaseerkp11@gmail.com  |  linkedin.com/in/jaseerkp/</w:t>
@@ -62,19 +68,116 @@
     </w:p>
     <w:p>
       <w:pPr>
-        <w:spacing w:before="200" w:after="80" w:line="240" w:lineRule="auto"/>
-        <w:pBdr>
-          <w:bottom w:val="single" w:sz="12" w:space="1" w:color="1B3A4B"/>
-        </w:pBdr>
+        <w:spacing w:before="200" w:after="120" w:line="240" w:lineRule="auto"/>
+        <w:shd w:val="clear" w:color="auto" w:fill="0F2C3C"/>
       </w:pPr>
       <w:r>
         <w:rPr>
           <w:rFonts w:ascii="Calibri" w:hAnsi="Calibri" w:eastAsia="Calibri"/>
           <w:b/>
-          <w:color w:val="1B3A4B"/>
-          <w:sz w:val="24"/>
+          <w:color w:val="FFFFFF"/>
+          <w:sz w:val="22"/>
         </w:rPr>
-        <w:t>PROFESSIONAL SUMMARY</w:t>
+        <w:t xml:space="preserve">  AT A GLANCE  </w:t>
+      </w:r>
+    </w:p>
+    <w:p>
+      <w:pPr>
+        <w:spacing w:before="0" w:after="40" w:line="230" w:lineRule="auto"/>
+      </w:pPr>
+      <w:r>
+        <w:rPr>
+          <w:rFonts w:ascii="Calibri" w:hAnsi="Calibri" w:eastAsia="Calibri"/>
+          <w:b/>
+          <w:sz w:val="21"/>
+        </w:rPr>
+        <w:t xml:space="preserve">UAE Experience: </w:t>
+      </w:r>
+      <w:r>
+        <w:rPr>
+          <w:rFonts w:ascii="Calibri" w:hAnsi="Calibri" w:eastAsia="Calibri"/>
+          <w:b w:val="0"/>
+          <w:sz w:val="21"/>
+        </w:rPr>
+        <w:t>Abu Dhabi — Interior Fit-Out / Hotel Projects</w:t>
+      </w:r>
+    </w:p>
+    <w:p>
+      <w:pPr>
+        <w:spacing w:before="0" w:after="40" w:line="230" w:lineRule="auto"/>
+      </w:pPr>
+      <w:r>
+        <w:rPr>
+          <w:rFonts w:ascii="Calibri" w:hAnsi="Calibri" w:eastAsia="Calibri"/>
+          <w:b/>
+          <w:sz w:val="21"/>
+        </w:rPr>
+        <w:t xml:space="preserve">Career Growth: </w:t>
+      </w:r>
+      <w:r>
+        <w:rPr>
+          <w:rFonts w:ascii="Calibri" w:hAnsi="Calibri" w:eastAsia="Calibri"/>
+          <w:b w:val="0"/>
+          <w:sz w:val="21"/>
+        </w:rPr>
+        <w:t>Joined as Accountant; expanded into operations, procurement and project coordination within 5–6 months</w:t>
+      </w:r>
+    </w:p>
+    <w:p>
+      <w:pPr>
+        <w:spacing w:before="0" w:after="40" w:line="230" w:lineRule="auto"/>
+      </w:pPr>
+      <w:r>
+        <w:rPr>
+          <w:rFonts w:ascii="Calibri" w:hAnsi="Calibri" w:eastAsia="Calibri"/>
+          <w:b/>
+          <w:sz w:val="21"/>
+        </w:rPr>
+        <w:t xml:space="preserve">Team Leadership: </w:t>
+      </w:r>
+      <w:r>
+        <w:rPr>
+          <w:rFonts w:ascii="Calibri" w:hAnsi="Calibri" w:eastAsia="Calibri"/>
+          <w:b w:val="0"/>
+          <w:sz w:val="21"/>
+        </w:rPr>
+        <w:t>Supervised and coordinated approximately 25–30 staff</w:t>
+      </w:r>
+    </w:p>
+    <w:p>
+      <w:pPr>
+        <w:spacing w:before="0" w:after="40" w:line="230" w:lineRule="auto"/>
+      </w:pPr>
+      <w:r>
+        <w:rPr>
+          <w:rFonts w:ascii="Calibri" w:hAnsi="Calibri" w:eastAsia="Calibri"/>
+          <w:b/>
+          <w:sz w:val="21"/>
+        </w:rPr>
+        <w:t xml:space="preserve">Visa &amp; Relocation: </w:t>
+      </w:r>
+      <w:r>
+        <w:rPr>
+          <w:rFonts w:ascii="Calibri" w:hAnsi="Calibri" w:eastAsia="Calibri"/>
+          <w:b w:val="0"/>
+          <w:sz w:val="21"/>
+        </w:rPr>
+        <w:t>UAE Residence Visa valid until December 2027; available for UAE relocation</w:t>
+      </w:r>
+    </w:p>
+    <w:p>
+      <w:pPr>
+        <w:spacing w:before="200" w:after="120" w:line="240" w:lineRule="auto"/>
+        <w:shd w:val="clear" w:color="auto" w:fill="0F2C3C"/>
+      </w:pPr>
+      <w:r>
+        <w:rPr>
+          <w:rFonts w:ascii="Calibri" w:hAnsi="Calibri" w:eastAsia="Calibri"/>
+          <w:b/>
+          <w:color w:val="FFFFFF"/>
+          <w:sz w:val="22"/>
+        </w:rPr>
+        <w:t xml:space="preserve">  PROFESSIONAL SUMMARY  </w:t>
       </w:r>
     </w:p>
     <w:p>
@@ -92,19 +195,17 @@
     </w:p>
     <w:p>
       <w:pPr>
-        <w:spacing w:before="200" w:after="80" w:line="240" w:lineRule="auto"/>
-        <w:pBdr>
-          <w:bottom w:val="single" w:sz="12" w:space="1" w:color="1B3A4B"/>
-        </w:pBdr>
+        <w:spacing w:before="200" w:after="120" w:line="240" w:lineRule="auto"/>
+        <w:shd w:val="clear" w:color="auto" w:fill="0F2C3C"/>
       </w:pPr>
       <w:r>
         <w:rPr>
           <w:rFonts w:ascii="Calibri" w:hAnsi="Calibri" w:eastAsia="Calibri"/>
           <w:b/>
-          <w:color w:val="1B3A4B"/>
-          <w:sz w:val="24"/>
+          <w:color w:val="FFFFFF"/>
+          <w:sz w:val="22"/>
         </w:rPr>
-        <w:t>CORE SKILLS</w:t>
+        <w:t xml:space="preserve">  CORE SKILLS  </w:t>
       </w:r>
     </w:p>
     <w:p>
@@ -193,19 +294,17 @@
     </w:p>
     <w:p>
       <w:pPr>
-        <w:spacing w:before="200" w:after="80" w:line="240" w:lineRule="auto"/>
-        <w:pBdr>
-          <w:bottom w:val="single" w:sz="12" w:space="1" w:color="1B3A4B"/>
-        </w:pBdr>
+        <w:spacing w:before="200" w:after="120" w:line="240" w:lineRule="auto"/>
+        <w:shd w:val="clear" w:color="auto" w:fill="0F2C3C"/>
       </w:pPr>
       <w:r>
         <w:rPr>
           <w:rFonts w:ascii="Calibri" w:hAnsi="Calibri" w:eastAsia="Calibri"/>
           <w:b/>
-          <w:color w:val="1B3A4B"/>
-          <w:sz w:val="24"/>
+          <w:color w:val="FFFFFF"/>
+          <w:sz w:val="22"/>
         </w:rPr>
-        <w:t>PROFESSIONAL EXPERIENCE</w:t>
+        <w:t xml:space="preserve">  PROFESSIONAL EXPERIENCE  </w:t>
       </w:r>
     </w:p>
     <w:p>
@@ -219,7 +318,7 @@
         <w:rPr>
           <w:rFonts w:ascii="Calibri" w:hAnsi="Calibri" w:eastAsia="Calibri"/>
           <w:b/>
-          <w:color w:val="1B3A4B"/>
+          <w:color w:val="0F2C3C"/>
           <w:sz w:val="22"/>
         </w:rPr>
         <w:t>INTROYALE INTERIORS LLC  —  Abu Dhabi, United Arab Emirates</w:t>
@@ -227,7 +326,8 @@
       <w:r>
         <w:rPr>
           <w:rFonts w:ascii="Calibri" w:hAnsi="Calibri" w:eastAsia="Calibri"/>
-          <w:b w:val="0"/>
+          <w:b/>
+          <w:color w:val="C4A35A"/>
           <w:sz w:val="21"/>
         </w:rPr>
         <w:tab/>
@@ -268,6 +368,7 @@
         <w:rPr>
           <w:rFonts w:ascii="Calibri" w:hAnsi="Calibri" w:eastAsia="Calibri"/>
           <w:b/>
+          <w:color w:val="0F2C3C"/>
           <w:sz w:val="21"/>
         </w:rPr>
         <w:t>Accounting &amp; Finance</w:t>
@@ -351,6 +452,7 @@
         <w:rPr>
           <w:rFonts w:ascii="Calibri" w:hAnsi="Calibri" w:eastAsia="Calibri"/>
           <w:b/>
+          <w:color w:val="0F2C3C"/>
           <w:sz w:val="21"/>
         </w:rPr>
         <w:t>RFQ, Quotation &amp; Client Coordination</w:t>
@@ -406,6 +508,7 @@
         <w:rPr>
           <w:rFonts w:ascii="Calibri" w:hAnsi="Calibri" w:eastAsia="Calibri"/>
           <w:b/>
+          <w:color w:val="0F2C3C"/>
           <w:sz w:val="21"/>
         </w:rPr>
         <w:t>Procurement &amp; Purchasing</w:t>
@@ -475,6 +578,7 @@
         <w:rPr>
           <w:rFonts w:ascii="Calibri" w:hAnsi="Calibri" w:eastAsia="Calibri"/>
           <w:b/>
+          <w:color w:val="0F2C3C"/>
           <w:sz w:val="21"/>
         </w:rPr>
         <w:t>Project Coordination &amp; Execution</w:t>
@@ -558,6 +662,7 @@
         <w:rPr>
           <w:rFonts w:ascii="Calibri" w:hAnsi="Calibri" w:eastAsia="Calibri"/>
           <w:b/>
+          <w:color w:val="0F2C3C"/>
           <w:sz w:val="21"/>
         </w:rPr>
         <w:t>Staff &amp; Operations Management</w:t>
@@ -616,7 +721,7 @@
         <w:rPr>
           <w:rFonts w:ascii="Calibri" w:hAnsi="Calibri" w:eastAsia="Calibri"/>
           <w:b/>
-          <w:color w:val="1B3A4B"/>
+          <w:color w:val="0F2C3C"/>
           <w:sz w:val="22"/>
         </w:rPr>
         <w:t>TUBEES FOODS  —  Junior Accounts Assistant</w:t>
@@ -624,7 +729,8 @@
       <w:r>
         <w:rPr>
           <w:rFonts w:ascii="Calibri" w:hAnsi="Calibri" w:eastAsia="Calibri"/>
-          <w:b w:val="0"/>
+          <w:b/>
+          <w:color w:val="C4A35A"/>
           <w:sz w:val="21"/>
         </w:rPr>
         <w:tab/>
@@ -675,19 +781,17 @@
     </w:p>
     <w:p>
       <w:pPr>
-        <w:spacing w:before="200" w:after="80" w:line="240" w:lineRule="auto"/>
-        <w:pBdr>
-          <w:bottom w:val="single" w:sz="12" w:space="1" w:color="1B3A4B"/>
-        </w:pBdr>
+        <w:spacing w:before="200" w:after="120" w:line="240" w:lineRule="auto"/>
+        <w:shd w:val="clear" w:color="auto" w:fill="0F2C3C"/>
       </w:pPr>
       <w:r>
         <w:rPr>
           <w:rFonts w:ascii="Calibri" w:hAnsi="Calibri" w:eastAsia="Calibri"/>
           <w:b/>
-          <w:color w:val="1B3A4B"/>
-          <w:sz w:val="24"/>
+          <w:color w:val="FFFFFF"/>
+          <w:sz w:val="22"/>
         </w:rPr>
-        <w:t>EDUCATION</w:t>
+        <w:t xml:space="preserve">  EDUCATION  </w:t>
       </w:r>
     </w:p>
     <w:p>
@@ -701,7 +805,7 @@
         <w:rPr>
           <w:rFonts w:ascii="Calibri" w:hAnsi="Calibri" w:eastAsia="Calibri"/>
           <w:b/>
-          <w:color w:val="1B3A4B"/>
+          <w:color w:val="0F2C3C"/>
           <w:sz w:val="22"/>
         </w:rPr>
         <w:t>UNIVERSITY OF CALICUT  —  Bachelor of Commerce (B.Com)</w:t>
@@ -709,7 +813,8 @@
       <w:r>
         <w:rPr>
           <w:rFonts w:ascii="Calibri" w:hAnsi="Calibri" w:eastAsia="Calibri"/>
-          <w:b w:val="0"/>
+          <w:b/>
+          <w:color w:val="C4A35A"/>
           <w:sz w:val="21"/>
         </w:rPr>
         <w:tab/>
@@ -727,7 +832,7 @@
         <w:rPr>
           <w:rFonts w:ascii="Calibri" w:hAnsi="Calibri" w:eastAsia="Calibri"/>
           <w:b/>
-          <w:color w:val="1B3A4B"/>
+          <w:color w:val="0F2C3C"/>
           <w:sz w:val="22"/>
         </w:rPr>
         <w:t>HSS ANAMANGAD  —  Higher Secondary Education</w:t>
@@ -735,7 +840,8 @@
       <w:r>
         <w:rPr>
           <w:rFonts w:ascii="Calibri" w:hAnsi="Calibri" w:eastAsia="Calibri"/>
-          <w:b w:val="0"/>
+          <w:b/>
+          <w:color w:val="C4A35A"/>
           <w:sz w:val="21"/>
         </w:rPr>
         <w:tab/>
@@ -744,19 +850,17 @@
     </w:p>
     <w:p>
       <w:pPr>
-        <w:spacing w:before="200" w:after="80" w:line="240" w:lineRule="auto"/>
-        <w:pBdr>
-          <w:bottom w:val="single" w:sz="12" w:space="1" w:color="1B3A4B"/>
-        </w:pBdr>
+        <w:spacing w:before="200" w:after="120" w:line="240" w:lineRule="auto"/>
+        <w:shd w:val="clear" w:color="auto" w:fill="0F2C3C"/>
       </w:pPr>
       <w:r>
         <w:rPr>
           <w:rFonts w:ascii="Calibri" w:hAnsi="Calibri" w:eastAsia="Calibri"/>
           <w:b/>
-          <w:color w:val="1B3A4B"/>
-          <w:sz w:val="24"/>
+          <w:color w:val="FFFFFF"/>
+          <w:sz w:val="22"/>
         </w:rPr>
-        <w:t>LANGUAGES</w:t>
+        <w:t xml:space="preserve">  LANGUAGES  </w:t>
       </w:r>
     </w:p>
     <w:p>
@@ -774,19 +878,17 @@
     </w:p>
     <w:p>
       <w:pPr>
-        <w:spacing w:before="200" w:after="80" w:line="240" w:lineRule="auto"/>
-        <w:pBdr>
-          <w:bottom w:val="single" w:sz="12" w:space="1" w:color="1B3A4B"/>
-        </w:pBdr>
+        <w:spacing w:before="200" w:after="120" w:line="240" w:lineRule="auto"/>
+        <w:shd w:val="clear" w:color="auto" w:fill="0F2C3C"/>
       </w:pPr>
       <w:r>
         <w:rPr>
           <w:rFonts w:ascii="Calibri" w:hAnsi="Calibri" w:eastAsia="Calibri"/>
           <w:b/>
-          <w:color w:val="1B3A4B"/>
-          <w:sz w:val="24"/>
+          <w:color w:val="FFFFFF"/>
+          <w:sz w:val="22"/>
         </w:rPr>
-        <w:t>ADDITIONAL INFORMATION</w:t>
+        <w:t xml:space="preserve">  ADDITIONAL INFORMATION  </w:t>
       </w:r>
     </w:p>
     <w:p>
@@ -825,7 +927,7 @@
     </w:p>
     <w:sectPr>
       <w:pgSz w:w="12240" w:h="15840"/>
-      <w:pgMar w:top="792" w:right="1008" w:bottom="720" w:left="1008" w:header="720" w:footer="720" w:gutter="0"/>
+      <w:pgMar w:top="720" w:right="936" w:bottom="720" w:left="936" w:header="720" w:footer="720" w:gutter="0"/>
       <w:cols w:space="720"/>
       <w:docGrid w:linePitch="360"/>
     </w:sectPr>
@@ -1198,7 +1300,7 @@
     <w:rsid w:val="00FC693F"/>
     <w:rPr>
       <w:rFonts w:ascii="Calibri" w:hAnsi="Calibri"/>
-      <w:color w:val="222222"/>
+      <w:color w:val="2C2C2C"/>
       <w:sz w:val="21"/>
     </w:rPr>
   </w:style>

</xml_diff>

<commit_message>
Match the Word CV layout to the PDF design
Rebuild the .docx with the same navy header, gold accent, snapshot
cards, skill tiles, language boxes, and section bars as the PDF.

Co-authored-by: jaseerkp11 <jaseerkp11@users.noreply.github.com>
</commit_message>
<xml_diff>
--- a/cv/Mohammed_Jaseer_CV_ATS.docx
+++ b/cv/Mohammed_Jaseer_CV_ATS.docx
@@ -2,372 +2,1014 @@
 <file path=word/document.xml><?xml version="1.0" encoding="utf-8"?>
 <w:document xmlns:wpc="http://schemas.microsoft.com/office/word/2010/wordprocessingCanvas" xmlns:mo="http://schemas.microsoft.com/office/mac/office/2008/main" xmlns:mc="http://schemas.openxmlformats.org/markup-compatibility/2006" xmlns:mv="urn:schemas-microsoft-com:mac:vml" xmlns:o="urn:schemas-microsoft-com:office:office" xmlns:r="http://schemas.openxmlformats.org/officeDocument/2006/relationships" xmlns:m="http://schemas.openxmlformats.org/officeDocument/2006/math" xmlns:v="urn:schemas-microsoft-com:vml" xmlns:wp14="http://schemas.microsoft.com/office/word/2010/wordprocessingDrawing" xmlns:wp="http://schemas.openxmlformats.org/drawingml/2006/wordprocessingDrawing" xmlns:w10="urn:schemas-microsoft-com:office:word" xmlns:w="http://schemas.openxmlformats.org/wordprocessingml/2006/main" xmlns:w14="http://schemas.microsoft.com/office/word/2010/wordml" xmlns:wpg="http://schemas.microsoft.com/office/word/2010/wordprocessingGroup" xmlns:wpi="http://schemas.microsoft.com/office/word/2010/wordprocessingInk" xmlns:wne="http://schemas.microsoft.com/office/word/2006/wordml" xmlns:wps="http://schemas.microsoft.com/office/word/2010/wordprocessingShape" mc:Ignorable="w14 wp14">
   <w:body>
+    <w:tbl>
+      <w:tblPr>
+        <w:tblW w:type="pct" w:w="5000"/>
+        <w:tblLayout w:type="autofit"/>
+        <w:tblLook w:firstColumn="1" w:firstRow="1" w:lastColumn="0" w:lastRow="0" w:noHBand="0" w:noVBand="1" w:val="04A0"/>
+        <w:tblInd w:w="0" w:type="dxa"/>
+        <w:tblBorders>
+          <w:top w:val="nil" w:sz="0" w:space="0" w:color="auto"/>
+          <w:left w:val="nil" w:sz="0" w:space="0" w:color="auto"/>
+          <w:bottom w:val="nil" w:sz="0" w:space="0" w:color="auto"/>
+          <w:right w:val="nil" w:sz="0" w:space="0" w:color="auto"/>
+          <w:insideH w:val="nil" w:sz="0" w:space="0" w:color="auto"/>
+          <w:insideV w:val="nil" w:sz="0" w:space="0" w:color="auto"/>
+        </w:tblBorders>
+      </w:tblPr>
+      <w:tblGrid>
+        <w:gridCol w:w="10318"/>
+      </w:tblGrid>
+      <w:tr>
+        <w:tc>
+          <w:tcPr>
+            <w:tcW w:type="dxa" w:w="10318"/>
+            <w:shd w:val="clear" w:color="auto" w:fill="0F2C3C"/>
+            <w:tcMar>
+              <w:top w:w="80" w:type="dxa"/>
+              <w:left w:w="100" w:type="dxa"/>
+              <w:bottom w:w="40" w:type="dxa"/>
+              <w:right w:w="100" w:type="dxa"/>
+            </w:tcMar>
+            <w:tcBorders>
+              <w:top w:val="nil" w:sz="0" w:space="0" w:color="auto"/>
+              <w:left w:val="nil" w:sz="0" w:space="0" w:color="auto"/>
+              <w:bottom w:val="nil" w:sz="0" w:space="0" w:color="auto"/>
+              <w:right w:val="nil" w:sz="0" w:space="0" w:color="auto"/>
+            </w:tcBorders>
+          </w:tcPr>
+          <w:p>
+            <w:pPr>
+              <w:spacing w:before="160" w:after="0" w:line="220" w:lineRule="auto"/>
+              <w:jc w:val="center"/>
+            </w:pPr>
+            <w:r>
+              <w:rPr>
+                <w:rFonts w:ascii="Calibri" w:hAnsi="Calibri" w:eastAsia="Calibri"/>
+                <w:b/>
+                <w:i w:val="0"/>
+                <w:color w:val="FFFFFF"/>
+                <w:sz w:val="40"/>
+              </w:rPr>
+              <w:t>MOHAMMED JASEER</w:t>
+            </w:r>
+          </w:p>
+        </w:tc>
+      </w:tr>
+      <w:tr>
+        <w:tc>
+          <w:tcPr>
+            <w:tcW w:type="dxa" w:w="10318"/>
+            <w:shd w:val="clear" w:color="auto" w:fill="0F2C3C"/>
+            <w:tcMar>
+              <w:top w:w="40" w:type="dxa"/>
+              <w:left w:w="100" w:type="dxa"/>
+              <w:bottom w:w="40" w:type="dxa"/>
+              <w:right w:w="100" w:type="dxa"/>
+            </w:tcMar>
+            <w:tcBorders>
+              <w:top w:val="nil" w:sz="0" w:space="0" w:color="auto"/>
+              <w:left w:val="nil" w:sz="0" w:space="0" w:color="auto"/>
+              <w:bottom w:val="nil" w:sz="0" w:space="0" w:color="auto"/>
+              <w:right w:val="nil" w:sz="0" w:space="0" w:color="auto"/>
+            </w:tcBorders>
+          </w:tcPr>
+          <w:p>
+            <w:pPr>
+              <w:spacing w:before="0" w:after="40" w:line="220" w:lineRule="auto"/>
+              <w:jc w:val="center"/>
+            </w:pPr>
+            <w:r>
+              <w:rPr>
+                <w:rFonts w:ascii="Calibri" w:hAnsi="Calibri" w:eastAsia="Calibri"/>
+                <w:b/>
+                <w:i w:val="0"/>
+                <w:color w:val="C4A35A"/>
+                <w:sz w:val="21"/>
+              </w:rPr>
+              <w:t>Accounting  |  Finance  |  Operations  |  Procurement  |  Project Coordination</w:t>
+            </w:r>
+          </w:p>
+        </w:tc>
+      </w:tr>
+      <w:tr>
+        <w:tc>
+          <w:tcPr>
+            <w:tcW w:type="dxa" w:w="10318"/>
+            <w:shd w:val="clear" w:color="auto" w:fill="0F2C3C"/>
+            <w:tcMar>
+              <w:top w:w="40" w:type="dxa"/>
+              <w:left w:w="100" w:type="dxa"/>
+              <w:bottom w:w="40" w:type="dxa"/>
+              <w:right w:w="100" w:type="dxa"/>
+            </w:tcMar>
+            <w:tcBorders>
+              <w:top w:val="nil" w:sz="0" w:space="0" w:color="auto"/>
+              <w:left w:val="nil" w:sz="0" w:space="0" w:color="auto"/>
+              <w:bottom w:val="nil" w:sz="0" w:space="0" w:color="auto"/>
+              <w:right w:val="nil" w:sz="0" w:space="0" w:color="auto"/>
+            </w:tcBorders>
+          </w:tcPr>
+          <w:p>
+            <w:pPr>
+              <w:spacing w:before="40" w:after="0" w:line="220" w:lineRule="auto"/>
+              <w:jc w:val="center"/>
+            </w:pPr>
+            <w:r>
+              <w:rPr>
+                <w:rFonts w:ascii="Calibri" w:hAnsi="Calibri" w:eastAsia="Calibri"/>
+                <w:b w:val="0"/>
+                <w:i w:val="0"/>
+                <w:color w:val="FFFFFF"/>
+                <w:sz w:val="19"/>
+              </w:rPr>
+              <w:t>Currently in India  |  Available for UAE Relocation  |  UAE Residence Visa valid until December 2027</w:t>
+            </w:r>
+          </w:p>
+        </w:tc>
+      </w:tr>
+      <w:tr>
+        <w:tc>
+          <w:tcPr>
+            <w:tcW w:type="dxa" w:w="10318"/>
+            <w:shd w:val="clear" w:color="auto" w:fill="0F2C3C"/>
+            <w:tcMar>
+              <w:top w:w="40" w:type="dxa"/>
+              <w:left w:w="100" w:type="dxa"/>
+              <w:bottom w:w="90" w:type="dxa"/>
+              <w:right w:w="100" w:type="dxa"/>
+            </w:tcMar>
+            <w:tcBorders>
+              <w:top w:val="nil" w:sz="0" w:space="0" w:color="auto"/>
+              <w:left w:val="nil" w:sz="0" w:space="0" w:color="auto"/>
+              <w:bottom w:val="nil" w:sz="0" w:space="0" w:color="auto"/>
+              <w:right w:val="nil" w:sz="0" w:space="0" w:color="auto"/>
+            </w:tcBorders>
+          </w:tcPr>
+          <w:p>
+            <w:pPr>
+              <w:spacing w:before="0" w:after="160" w:line="220" w:lineRule="auto"/>
+              <w:jc w:val="center"/>
+            </w:pPr>
+            <w:r>
+              <w:rPr>
+                <w:rFonts w:ascii="Calibri" w:hAnsi="Calibri" w:eastAsia="Calibri"/>
+                <w:b w:val="0"/>
+                <w:i w:val="0"/>
+                <w:color w:val="FFFFFF"/>
+                <w:sz w:val="20"/>
+              </w:rPr>
+              <w:t>+971 56 454 9259  |  mohammedjaseerkp11@gmail.com  |  linkedin.com/in/jaseerkp/</w:t>
+            </w:r>
+          </w:p>
+        </w:tc>
+      </w:tr>
+    </w:tbl>
+    <w:tbl>
+      <w:tblPr>
+        <w:tblW w:type="pct" w:w="5000"/>
+        <w:tblLayout w:type="autofit"/>
+        <w:tblLook w:firstColumn="1" w:firstRow="1" w:lastColumn="0" w:lastRow="0" w:noHBand="0" w:noVBand="1" w:val="04A0"/>
+        <w:tblInd w:w="0" w:type="dxa"/>
+        <w:tblBorders>
+          <w:top w:val="nil" w:sz="0" w:space="0" w:color="auto"/>
+          <w:left w:val="nil" w:sz="0" w:space="0" w:color="auto"/>
+          <w:bottom w:val="nil" w:sz="0" w:space="0" w:color="auto"/>
+          <w:right w:val="nil" w:sz="0" w:space="0" w:color="auto"/>
+          <w:insideH w:val="nil" w:sz="0" w:space="0" w:color="auto"/>
+          <w:insideV w:val="nil" w:sz="0" w:space="0" w:color="auto"/>
+        </w:tblBorders>
+      </w:tblPr>
+      <w:tblGrid>
+        <w:gridCol w:w="10318"/>
+      </w:tblGrid>
+      <w:tr>
+        <w:tc>
+          <w:tcPr>
+            <w:tcW w:type="dxa" w:w="10318"/>
+            <w:shd w:val="clear" w:color="auto" w:fill="C4A35A"/>
+            <w:tcMar>
+              <w:top w:w="0" w:type="dxa"/>
+              <w:left w:w="0" w:type="dxa"/>
+              <w:bottom w:w="0" w:type="dxa"/>
+              <w:right w:w="0" w:type="dxa"/>
+            </w:tcMar>
+            <w:tcBorders>
+              <w:top w:val="nil" w:sz="0" w:space="0" w:color="auto"/>
+              <w:left w:val="nil" w:sz="0" w:space="0" w:color="auto"/>
+              <w:bottom w:val="nil" w:sz="0" w:space="0" w:color="auto"/>
+              <w:right w:val="nil" w:sz="0" w:space="0" w:color="auto"/>
+            </w:tcBorders>
+          </w:tcPr>
+          <w:p>
+            <w:pPr>
+              <w:spacing w:before="0" w:after="0" w:line="80" w:lineRule="auto"/>
+            </w:pPr>
+            <w:r>
+              <w:rPr>
+                <w:rFonts w:ascii="Calibri" w:hAnsi="Calibri" w:eastAsia="Calibri"/>
+                <w:b w:val="0"/>
+                <w:i w:val="0"/>
+                <w:color w:val="C4A35A"/>
+                <w:sz w:val="8"/>
+              </w:rPr>
+              <w:t xml:space="preserve"> </w:t>
+            </w:r>
+          </w:p>
+        </w:tc>
+      </w:tr>
+    </w:tbl>
     <w:p>
       <w:pPr>
-        <w:spacing w:before="0" w:after="40" w:line="240" w:lineRule="auto"/>
-        <w:jc w:val="center"/>
-        <w:shd w:val="clear" w:color="auto" w:fill="0F2C3C"/>
+        <w:spacing w:before="120" w:after="80" w:line="200" w:lineRule="auto"/>
       </w:pPr>
-      <w:r>
-        <w:rPr>
-          <w:rFonts w:ascii="Calibri" w:hAnsi="Calibri" w:eastAsia="Calibri"/>
-          <w:b/>
-          <w:color w:val="FFFFFF"/>
-          <w:sz w:val="44"/>
-        </w:rPr>
-        <w:t>MOHAMMED JASEER</w:t>
-      </w:r>
+    </w:p>
+    <w:tbl>
+      <w:tblPr>
+        <w:tblW w:type="pct" w:w="5000"/>
+        <w:tblLayout w:type="autofit"/>
+        <w:tblLook w:firstColumn="1" w:firstRow="1" w:lastColumn="0" w:lastRow="0" w:noHBand="0" w:noVBand="1" w:val="04A0"/>
+        <w:tblInd w:w="0" w:type="dxa"/>
+        <w:tblBorders>
+          <w:top w:val="nil" w:sz="0" w:space="0" w:color="auto"/>
+          <w:left w:val="nil" w:sz="0" w:space="0" w:color="auto"/>
+          <w:bottom w:val="nil" w:sz="0" w:space="0" w:color="auto"/>
+          <w:right w:val="nil" w:sz="0" w:space="0" w:color="auto"/>
+          <w:insideH w:val="nil" w:sz="0" w:space="0" w:color="auto"/>
+          <w:insideV w:val="nil" w:sz="0" w:space="0" w:color="auto"/>
+        </w:tblBorders>
+      </w:tblPr>
+      <w:tblGrid>
+        <w:gridCol w:w="2579"/>
+        <w:gridCol w:w="2579"/>
+        <w:gridCol w:w="2579"/>
+        <w:gridCol w:w="2579"/>
+      </w:tblGrid>
+      <w:tr>
+        <w:tc>
+          <w:tcPr>
+            <w:tcW w:type="dxa" w:w="2579"/>
+            <w:shd w:val="clear" w:color="auto" w:fill="F6F1E6"/>
+            <w:tcMar>
+              <w:top w:w="70" w:type="dxa"/>
+              <w:left w:w="50" w:type="dxa"/>
+              <w:bottom w:w="70" w:type="dxa"/>
+              <w:right w:w="50" w:type="dxa"/>
+            </w:tcMar>
+            <w:tcBorders>
+              <w:top w:val="single" w:sz="18" w:space="0" w:color="C4A35A"/>
+              <w:left w:val="nil" w:sz="0" w:space="0" w:color="auto"/>
+              <w:bottom w:val="nil" w:sz="0" w:space="0" w:color="auto"/>
+              <w:right w:val="nil" w:sz="0" w:space="0" w:color="auto"/>
+            </w:tcBorders>
+          </w:tcPr>
+          <w:p>
+            <w:pPr>
+              <w:spacing w:before="0" w:after="0" w:line="220" w:lineRule="auto"/>
+              <w:jc w:val="center"/>
+            </w:pPr>
+            <w:r>
+              <w:rPr>
+                <w:rFonts w:ascii="Calibri" w:hAnsi="Calibri" w:eastAsia="Calibri"/>
+                <w:b w:val="0"/>
+                <w:i w:val="0"/>
+                <w:color w:val="5A6570"/>
+                <w:sz w:val="15"/>
+              </w:rPr>
+              <w:t>UAE EXPERIENCE</w:t>
+            </w:r>
+          </w:p>
+          <w:p>
+            <w:pPr>
+              <w:spacing w:before="0" w:after="40" w:line="220" w:lineRule="auto"/>
+              <w:jc w:val="center"/>
+            </w:pPr>
+            <w:r>
+              <w:rPr>
+                <w:rFonts w:ascii="Calibri" w:hAnsi="Calibri" w:eastAsia="Calibri"/>
+                <w:b/>
+                <w:i w:val="0"/>
+                <w:color w:val="0F2C3C"/>
+                <w:sz w:val="20"/>
+              </w:rPr>
+              <w:t>Abu Dhabi</w:t>
+            </w:r>
+          </w:p>
+        </w:tc>
+        <w:tc>
+          <w:tcPr>
+            <w:tcW w:type="dxa" w:w="2579"/>
+            <w:shd w:val="clear" w:color="auto" w:fill="F6F1E6"/>
+            <w:tcMar>
+              <w:top w:w="70" w:type="dxa"/>
+              <w:left w:w="50" w:type="dxa"/>
+              <w:bottom w:w="70" w:type="dxa"/>
+              <w:right w:w="50" w:type="dxa"/>
+            </w:tcMar>
+            <w:tcBorders>
+              <w:top w:val="single" w:sz="18" w:space="0" w:color="C4A35A"/>
+              <w:left w:val="nil" w:sz="0" w:space="0" w:color="auto"/>
+              <w:bottom w:val="nil" w:sz="0" w:space="0" w:color="auto"/>
+              <w:right w:val="nil" w:sz="0" w:space="0" w:color="auto"/>
+            </w:tcBorders>
+          </w:tcPr>
+          <w:p>
+            <w:pPr>
+              <w:spacing w:before="0" w:after="0" w:line="220" w:lineRule="auto"/>
+              <w:jc w:val="center"/>
+            </w:pPr>
+            <w:r>
+              <w:rPr>
+                <w:rFonts w:ascii="Calibri" w:hAnsi="Calibri" w:eastAsia="Calibri"/>
+                <w:b w:val="0"/>
+                <w:i w:val="0"/>
+                <w:color w:val="5A6570"/>
+                <w:sz w:val="15"/>
+              </w:rPr>
+              <w:t>TEAM SUPERVISED</w:t>
+            </w:r>
+          </w:p>
+          <w:p>
+            <w:pPr>
+              <w:spacing w:before="0" w:after="40" w:line="220" w:lineRule="auto"/>
+              <w:jc w:val="center"/>
+            </w:pPr>
+            <w:r>
+              <w:rPr>
+                <w:rFonts w:ascii="Calibri" w:hAnsi="Calibri" w:eastAsia="Calibri"/>
+                <w:b/>
+                <w:i w:val="0"/>
+                <w:color w:val="0F2C3C"/>
+                <w:sz w:val="20"/>
+              </w:rPr>
+              <w:t>25–30 Staff</w:t>
+            </w:r>
+          </w:p>
+        </w:tc>
+        <w:tc>
+          <w:tcPr>
+            <w:tcW w:type="dxa" w:w="2579"/>
+            <w:shd w:val="clear" w:color="auto" w:fill="F6F1E6"/>
+            <w:tcMar>
+              <w:top w:w="70" w:type="dxa"/>
+              <w:left w:w="50" w:type="dxa"/>
+              <w:bottom w:w="70" w:type="dxa"/>
+              <w:right w:w="50" w:type="dxa"/>
+            </w:tcMar>
+            <w:tcBorders>
+              <w:top w:val="single" w:sz="18" w:space="0" w:color="C4A35A"/>
+              <w:left w:val="nil" w:sz="0" w:space="0" w:color="auto"/>
+              <w:bottom w:val="nil" w:sz="0" w:space="0" w:color="auto"/>
+              <w:right w:val="nil" w:sz="0" w:space="0" w:color="auto"/>
+            </w:tcBorders>
+          </w:tcPr>
+          <w:p>
+            <w:pPr>
+              <w:spacing w:before="0" w:after="0" w:line="220" w:lineRule="auto"/>
+              <w:jc w:val="center"/>
+            </w:pPr>
+            <w:r>
+              <w:rPr>
+                <w:rFonts w:ascii="Calibri" w:hAnsi="Calibri" w:eastAsia="Calibri"/>
+                <w:b w:val="0"/>
+                <w:i w:val="0"/>
+                <w:color w:val="5A6570"/>
+                <w:sz w:val="15"/>
+              </w:rPr>
+              <w:t>RESIDENCE VISA</w:t>
+            </w:r>
+          </w:p>
+          <w:p>
+            <w:pPr>
+              <w:spacing w:before="0" w:after="40" w:line="220" w:lineRule="auto"/>
+              <w:jc w:val="center"/>
+            </w:pPr>
+            <w:r>
+              <w:rPr>
+                <w:rFonts w:ascii="Calibri" w:hAnsi="Calibri" w:eastAsia="Calibri"/>
+                <w:b/>
+                <w:i w:val="0"/>
+                <w:color w:val="0F2C3C"/>
+                <w:sz w:val="20"/>
+              </w:rPr>
+              <w:t>Valid to Dec 2027</w:t>
+            </w:r>
+          </w:p>
+        </w:tc>
+        <w:tc>
+          <w:tcPr>
+            <w:tcW w:type="dxa" w:w="2579"/>
+            <w:shd w:val="clear" w:color="auto" w:fill="F6F1E6"/>
+            <w:tcMar>
+              <w:top w:w="70" w:type="dxa"/>
+              <w:left w:w="50" w:type="dxa"/>
+              <w:bottom w:w="70" w:type="dxa"/>
+              <w:right w:w="50" w:type="dxa"/>
+            </w:tcMar>
+            <w:tcBorders>
+              <w:top w:val="single" w:sz="18" w:space="0" w:color="C4A35A"/>
+              <w:left w:val="nil" w:sz="0" w:space="0" w:color="auto"/>
+              <w:bottom w:val="nil" w:sz="0" w:space="0" w:color="auto"/>
+              <w:right w:val="nil" w:sz="0" w:space="0" w:color="auto"/>
+            </w:tcBorders>
+          </w:tcPr>
+          <w:p>
+            <w:pPr>
+              <w:spacing w:before="0" w:after="0" w:line="220" w:lineRule="auto"/>
+              <w:jc w:val="center"/>
+            </w:pPr>
+            <w:r>
+              <w:rPr>
+                <w:rFonts w:ascii="Calibri" w:hAnsi="Calibri" w:eastAsia="Calibri"/>
+                <w:b w:val="0"/>
+                <w:i w:val="0"/>
+                <w:color w:val="5A6570"/>
+                <w:sz w:val="15"/>
+              </w:rPr>
+              <w:t>INDUSTRY</w:t>
+            </w:r>
+          </w:p>
+          <w:p>
+            <w:pPr>
+              <w:spacing w:before="0" w:after="40" w:line="220" w:lineRule="auto"/>
+              <w:jc w:val="center"/>
+            </w:pPr>
+            <w:r>
+              <w:rPr>
+                <w:rFonts w:ascii="Calibri" w:hAnsi="Calibri" w:eastAsia="Calibri"/>
+                <w:b/>
+                <w:i w:val="0"/>
+                <w:color w:val="0F2C3C"/>
+                <w:sz w:val="20"/>
+              </w:rPr>
+              <w:t>Hotel Fit-Out</w:t>
+            </w:r>
+          </w:p>
+        </w:tc>
+      </w:tr>
+    </w:tbl>
+    <w:p>
+      <w:pPr>
+        <w:spacing w:before="120" w:after="40" w:line="200" w:lineRule="auto"/>
+      </w:pPr>
+    </w:p>
+    <w:tbl>
+      <w:tblPr>
+        <w:tblW w:type="pct" w:w="5000"/>
+        <w:tblLayout w:type="autofit"/>
+        <w:tblLook w:firstColumn="1" w:firstRow="1" w:lastColumn="0" w:lastRow="0" w:noHBand="0" w:noVBand="1" w:val="04A0"/>
+        <w:tblInd w:w="0" w:type="dxa"/>
+        <w:tblBorders>
+          <w:top w:val="nil" w:sz="0" w:space="0" w:color="auto"/>
+          <w:left w:val="nil" w:sz="0" w:space="0" w:color="auto"/>
+          <w:bottom w:val="nil" w:sz="0" w:space="0" w:color="auto"/>
+          <w:right w:val="nil" w:sz="0" w:space="0" w:color="auto"/>
+          <w:insideH w:val="nil" w:sz="0" w:space="0" w:color="auto"/>
+          <w:insideV w:val="nil" w:sz="0" w:space="0" w:color="auto"/>
+        </w:tblBorders>
+      </w:tblPr>
+      <w:tblGrid>
+        <w:gridCol w:w="10318"/>
+      </w:tblGrid>
+      <w:tr>
+        <w:tc>
+          <w:tcPr>
+            <w:tcW w:type="dxa" w:w="10318"/>
+            <w:shd w:val="clear" w:color="auto" w:fill="0F2C3C"/>
+            <w:tcMar>
+              <w:top w:w="50" w:type="dxa"/>
+              <w:left w:w="120" w:type="dxa"/>
+              <w:bottom w:w="50" w:type="dxa"/>
+              <w:right w:w="80" w:type="dxa"/>
+            </w:tcMar>
+            <w:tcBorders>
+              <w:top w:val="nil" w:sz="0" w:space="0" w:color="auto"/>
+              <w:left w:val="single" w:sz="24" w:space="0" w:color="C4A35A"/>
+              <w:bottom w:val="nil" w:sz="0" w:space="0" w:color="auto"/>
+              <w:right w:val="nil" w:sz="0" w:space="0" w:color="auto"/>
+            </w:tcBorders>
+          </w:tcPr>
+          <w:p>
+            <w:pPr>
+              <w:spacing w:before="0" w:after="0" w:line="220" w:lineRule="auto"/>
+              <w:jc w:val="left"/>
+            </w:pPr>
+            <w:r>
+              <w:rPr>
+                <w:rFonts w:ascii="Calibri" w:hAnsi="Calibri" w:eastAsia="Calibri"/>
+                <w:b/>
+                <w:i w:val="0"/>
+                <w:color w:val="FFFFFF"/>
+                <w:sz w:val="20"/>
+              </w:rPr>
+              <w:t>PROFESSIONAL SUMMARY</w:t>
+            </w:r>
+          </w:p>
+        </w:tc>
+      </w:tr>
+    </w:tbl>
+    <w:p>
+      <w:pPr>
+        <w:spacing w:before="40" w:after="40" w:line="200" w:lineRule="auto"/>
+      </w:pPr>
     </w:p>
     <w:p>
       <w:pPr>
-        <w:spacing w:before="0" w:after="40" w:line="230" w:lineRule="auto"/>
-        <w:jc w:val="center"/>
-        <w:shd w:val="clear" w:color="auto" w:fill="0F2C3C"/>
-      </w:pPr>
-      <w:r>
-        <w:rPr>
-          <w:rFonts w:ascii="Calibri" w:hAnsi="Calibri" w:eastAsia="Calibri"/>
-          <w:b/>
-          <w:color w:val="C4A35A"/>
-          <w:sz w:val="22"/>
-        </w:rPr>
-        <w:t>Accounting  |  Finance  |  Operations  |  Procurement  |  Project Coordination</w:t>
-      </w:r>
-    </w:p>
-    <w:p>
-      <w:pPr>
-        <w:spacing w:before="0" w:after="0" w:line="220" w:lineRule="auto"/>
-        <w:jc w:val="center"/>
-        <w:shd w:val="clear" w:color="auto" w:fill="17384A"/>
+        <w:spacing w:before="0" w:after="80" w:line="220" w:lineRule="auto"/>
+        <w:jc w:val="both"/>
       </w:pPr>
       <w:r>
         <w:rPr>
           <w:rFonts w:ascii="Calibri" w:hAnsi="Calibri" w:eastAsia="Calibri"/>
           <w:b w:val="0"/>
-          <w:color w:val="FFFFFF"/>
+          <w:i w:val="0"/>
+          <w:color w:val="2C2C2C"/>
           <w:sz w:val="20"/>
-        </w:rPr>
-        <w:t>Currently in India  |  Available for UAE Relocation  |  UAE Residence Visa valid until December 2027</w:t>
-      </w:r>
-    </w:p>
-    <w:p>
-      <w:pPr>
-        <w:spacing w:before="0" w:after="160" w:line="220" w:lineRule="auto"/>
-        <w:jc w:val="center"/>
-        <w:shd w:val="clear" w:color="auto" w:fill="17384A"/>
-      </w:pPr>
-      <w:r>
-        <w:rPr>
-          <w:rFonts w:ascii="Calibri" w:hAnsi="Calibri" w:eastAsia="Calibri"/>
-          <w:b w:val="0"/>
-          <w:color w:val="FFFFFF"/>
-          <w:sz w:val="21"/>
-        </w:rPr>
-        <w:t>+971 56 454 9259  |  mohammedjaseerkp11@gmail.com  |  linkedin.com/in/jaseerkp/</w:t>
-      </w:r>
-    </w:p>
-    <w:p>
-      <w:pPr>
-        <w:spacing w:before="200" w:after="120" w:line="240" w:lineRule="auto"/>
-        <w:shd w:val="clear" w:color="auto" w:fill="0F2C3C"/>
-      </w:pPr>
-      <w:r>
-        <w:rPr>
-          <w:rFonts w:ascii="Calibri" w:hAnsi="Calibri" w:eastAsia="Calibri"/>
-          <w:b/>
-          <w:color w:val="FFFFFF"/>
-          <w:sz w:val="22"/>
-        </w:rPr>
-        <w:t xml:space="preserve">  AT A GLANCE  </w:t>
-      </w:r>
-    </w:p>
-    <w:p>
-      <w:pPr>
-        <w:spacing w:before="0" w:after="40" w:line="230" w:lineRule="auto"/>
-      </w:pPr>
-      <w:r>
-        <w:rPr>
-          <w:rFonts w:ascii="Calibri" w:hAnsi="Calibri" w:eastAsia="Calibri"/>
-          <w:b/>
-          <w:sz w:val="21"/>
-        </w:rPr>
-        <w:t xml:space="preserve">UAE Experience: </w:t>
-      </w:r>
-      <w:r>
-        <w:rPr>
-          <w:rFonts w:ascii="Calibri" w:hAnsi="Calibri" w:eastAsia="Calibri"/>
-          <w:b w:val="0"/>
-          <w:sz w:val="21"/>
-        </w:rPr>
-        <w:t>Abu Dhabi — Interior Fit-Out / Hotel Projects</w:t>
-      </w:r>
-    </w:p>
-    <w:p>
-      <w:pPr>
-        <w:spacing w:before="0" w:after="40" w:line="230" w:lineRule="auto"/>
-      </w:pPr>
-      <w:r>
-        <w:rPr>
-          <w:rFonts w:ascii="Calibri" w:hAnsi="Calibri" w:eastAsia="Calibri"/>
-          <w:b/>
-          <w:sz w:val="21"/>
-        </w:rPr>
-        <w:t xml:space="preserve">Career Growth: </w:t>
-      </w:r>
-      <w:r>
-        <w:rPr>
-          <w:rFonts w:ascii="Calibri" w:hAnsi="Calibri" w:eastAsia="Calibri"/>
-          <w:b w:val="0"/>
-          <w:sz w:val="21"/>
-        </w:rPr>
-        <w:t>Joined as Accountant; expanded into operations, procurement and project coordination within 5–6 months</w:t>
-      </w:r>
-    </w:p>
-    <w:p>
-      <w:pPr>
-        <w:spacing w:before="0" w:after="40" w:line="230" w:lineRule="auto"/>
-      </w:pPr>
-      <w:r>
-        <w:rPr>
-          <w:rFonts w:ascii="Calibri" w:hAnsi="Calibri" w:eastAsia="Calibri"/>
-          <w:b/>
-          <w:sz w:val="21"/>
-        </w:rPr>
-        <w:t xml:space="preserve">Team Leadership: </w:t>
-      </w:r>
-      <w:r>
-        <w:rPr>
-          <w:rFonts w:ascii="Calibri" w:hAnsi="Calibri" w:eastAsia="Calibri"/>
-          <w:b w:val="0"/>
-          <w:sz w:val="21"/>
-        </w:rPr>
-        <w:t>Supervised and coordinated approximately 25–30 staff</w:t>
-      </w:r>
-    </w:p>
-    <w:p>
-      <w:pPr>
-        <w:spacing w:before="0" w:after="40" w:line="230" w:lineRule="auto"/>
-      </w:pPr>
-      <w:r>
-        <w:rPr>
-          <w:rFonts w:ascii="Calibri" w:hAnsi="Calibri" w:eastAsia="Calibri"/>
-          <w:b/>
-          <w:sz w:val="21"/>
-        </w:rPr>
-        <w:t xml:space="preserve">Visa &amp; Relocation: </w:t>
-      </w:r>
-      <w:r>
-        <w:rPr>
-          <w:rFonts w:ascii="Calibri" w:hAnsi="Calibri" w:eastAsia="Calibri"/>
-          <w:b w:val="0"/>
-          <w:sz w:val="21"/>
-        </w:rPr>
-        <w:t>UAE Residence Visa valid until December 2027; available for UAE relocation</w:t>
-      </w:r>
-    </w:p>
-    <w:p>
-      <w:pPr>
-        <w:spacing w:before="200" w:after="120" w:line="240" w:lineRule="auto"/>
-        <w:shd w:val="clear" w:color="auto" w:fill="0F2C3C"/>
-      </w:pPr>
-      <w:r>
-        <w:rPr>
-          <w:rFonts w:ascii="Calibri" w:hAnsi="Calibri" w:eastAsia="Calibri"/>
-          <w:b/>
-          <w:color w:val="FFFFFF"/>
-          <w:sz w:val="22"/>
-        </w:rPr>
-        <w:t xml:space="preserve">  PROFESSIONAL SUMMARY  </w:t>
-      </w:r>
-    </w:p>
-    <w:p>
-      <w:pPr>
-        <w:spacing w:before="0" w:after="40" w:line="230" w:lineRule="auto"/>
-      </w:pPr>
-      <w:r>
-        <w:rPr>
-          <w:rFonts w:ascii="Calibri" w:hAnsi="Calibri" w:eastAsia="Calibri"/>
-          <w:b w:val="0"/>
-          <w:sz w:val="21"/>
         </w:rPr>
         <w:t>Versatile Accounting and Operations professional with UAE experience across accounting, finance, procurement, purchasing, project coordination, client management, staff supervision, and business operations in the interior fit-out industry. Joined Introyale Interiors LLC (Abu Dhabi) as an Accountant and, within the first 5–6 months, took on additional responsibilities across company operations, procurement, project coordination, client management, staff supervision, and HR-related activities. Handled the complete workflow from client RFQ and quotation preparation through LPO receipt, material sourcing, purchasing, project scheduling, workforce coordination, and client follow-up. Worked directly with major hotel clients in the UAE and coordinated with purchasing, housekeeping, finance, operations, and engineering teams. Managed daily work allocation and scheduling for approximately 25–30 staff. B.Com graduate seeking Accounting, Finance, Procurement, Operations, Project Coordination, Administration, and related roles in the UAE.</w:t>
       </w:r>
     </w:p>
     <w:p>
       <w:pPr>
-        <w:spacing w:before="200" w:after="120" w:line="240" w:lineRule="auto"/>
-        <w:shd w:val="clear" w:color="auto" w:fill="0F2C3C"/>
+        <w:spacing w:before="120" w:after="40" w:line="200" w:lineRule="auto"/>
+      </w:pPr>
+    </w:p>
+    <w:tbl>
+      <w:tblPr>
+        <w:tblW w:type="pct" w:w="5000"/>
+        <w:tblLayout w:type="autofit"/>
+        <w:tblLook w:firstColumn="1" w:firstRow="1" w:lastColumn="0" w:lastRow="0" w:noHBand="0" w:noVBand="1" w:val="04A0"/>
+        <w:tblInd w:w="0" w:type="dxa"/>
+        <w:tblBorders>
+          <w:top w:val="nil" w:sz="0" w:space="0" w:color="auto"/>
+          <w:left w:val="nil" w:sz="0" w:space="0" w:color="auto"/>
+          <w:bottom w:val="nil" w:sz="0" w:space="0" w:color="auto"/>
+          <w:right w:val="nil" w:sz="0" w:space="0" w:color="auto"/>
+          <w:insideH w:val="nil" w:sz="0" w:space="0" w:color="auto"/>
+          <w:insideV w:val="nil" w:sz="0" w:space="0" w:color="auto"/>
+        </w:tblBorders>
+      </w:tblPr>
+      <w:tblGrid>
+        <w:gridCol w:w="10318"/>
+      </w:tblGrid>
+      <w:tr>
+        <w:tc>
+          <w:tcPr>
+            <w:tcW w:type="dxa" w:w="10318"/>
+            <w:shd w:val="clear" w:color="auto" w:fill="0F2C3C"/>
+            <w:tcMar>
+              <w:top w:w="50" w:type="dxa"/>
+              <w:left w:w="120" w:type="dxa"/>
+              <w:bottom w:w="50" w:type="dxa"/>
+              <w:right w:w="80" w:type="dxa"/>
+            </w:tcMar>
+            <w:tcBorders>
+              <w:top w:val="nil" w:sz="0" w:space="0" w:color="auto"/>
+              <w:left w:val="single" w:sz="24" w:space="0" w:color="C4A35A"/>
+              <w:bottom w:val="nil" w:sz="0" w:space="0" w:color="auto"/>
+              <w:right w:val="nil" w:sz="0" w:space="0" w:color="auto"/>
+            </w:tcBorders>
+          </w:tcPr>
+          <w:p>
+            <w:pPr>
+              <w:spacing w:before="0" w:after="0" w:line="220" w:lineRule="auto"/>
+              <w:jc w:val="left"/>
+            </w:pPr>
+            <w:r>
+              <w:rPr>
+                <w:rFonts w:ascii="Calibri" w:hAnsi="Calibri" w:eastAsia="Calibri"/>
+                <w:b/>
+                <w:i w:val="0"/>
+                <w:color w:val="FFFFFF"/>
+                <w:sz w:val="20"/>
+              </w:rPr>
+              <w:t>CORE SKILLS</w:t>
+            </w:r>
+          </w:p>
+        </w:tc>
+      </w:tr>
+    </w:tbl>
+    <w:p>
+      <w:pPr>
+        <w:spacing w:before="40" w:after="40" w:line="200" w:lineRule="auto"/>
+      </w:pPr>
+    </w:p>
+    <w:tbl>
+      <w:tblPr>
+        <w:tblW w:type="pct" w:w="5000"/>
+        <w:tblLayout w:type="autofit"/>
+        <w:tblLook w:firstColumn="1" w:firstRow="1" w:lastColumn="0" w:lastRow="0" w:noHBand="0" w:noVBand="1" w:val="04A0"/>
+        <w:tblInd w:w="0" w:type="dxa"/>
+        <w:tblBorders>
+          <w:top w:val="nil" w:sz="0" w:space="0" w:color="auto"/>
+          <w:left w:val="nil" w:sz="0" w:space="0" w:color="auto"/>
+          <w:bottom w:val="nil" w:sz="0" w:space="0" w:color="auto"/>
+          <w:right w:val="nil" w:sz="0" w:space="0" w:color="auto"/>
+          <w:insideH w:val="nil" w:sz="0" w:space="0" w:color="auto"/>
+          <w:insideV w:val="nil" w:sz="0" w:space="0" w:color="auto"/>
+        </w:tblBorders>
+      </w:tblPr>
+      <w:tblGrid>
+        <w:gridCol w:w="5159"/>
+        <w:gridCol w:w="5159"/>
+      </w:tblGrid>
+      <w:tr>
+        <w:tc>
+          <w:tcPr>
+            <w:tcW w:type="dxa" w:w="5159"/>
+            <w:shd w:val="clear" w:color="auto" w:fill="EEF4F7"/>
+            <w:tcMar>
+              <w:top w:w="70" w:type="dxa"/>
+              <w:left w:w="90" w:type="dxa"/>
+              <w:bottom w:w="70" w:type="dxa"/>
+              <w:right w:w="70" w:type="dxa"/>
+            </w:tcMar>
+            <w:tcBorders>
+              <w:top w:val="nil" w:sz="0" w:space="0" w:color="auto"/>
+              <w:left w:val="single" w:sz="24" w:space="0" w:color="C4A35A"/>
+              <w:bottom w:val="nil" w:sz="0" w:space="0" w:color="auto"/>
+              <w:right w:val="nil" w:sz="0" w:space="0" w:color="auto"/>
+            </w:tcBorders>
+          </w:tcPr>
+          <w:p>
+            <w:pPr>
+              <w:spacing w:before="0" w:after="40" w:line="220" w:lineRule="auto"/>
+              <w:jc w:val="left"/>
+            </w:pPr>
+            <w:r>
+              <w:rPr>
+                <w:rFonts w:ascii="Calibri" w:hAnsi="Calibri" w:eastAsia="Calibri"/>
+                <w:b/>
+                <w:i w:val="0"/>
+                <w:color w:val="0F2C3C"/>
+                <w:sz w:val="20"/>
+              </w:rPr>
+              <w:t>Accounting &amp; Finance</w:t>
+            </w:r>
+          </w:p>
+          <w:p>
+            <w:pPr>
+              <w:spacing w:before="0" w:after="40" w:line="220" w:lineRule="auto"/>
+              <w:jc w:val="left"/>
+            </w:pPr>
+            <w:r>
+              <w:rPr>
+                <w:rFonts w:ascii="Calibri" w:hAnsi="Calibri" w:eastAsia="Calibri"/>
+                <w:b w:val="0"/>
+                <w:i w:val="0"/>
+                <w:color w:val="2C2C2C"/>
+                <w:sz w:val="18"/>
+              </w:rPr>
+              <w:t>Accounting and Bookkeeping; Accounts Payable (AP); Accounts Receivable (AR); Purchase and Sales Entries; Invoicing and Billing; Receivables Follow-up; Payment Follow-up; Financial Documentation; VAT Preparation and Filing</w:t>
+            </w:r>
+          </w:p>
+        </w:tc>
+        <w:tc>
+          <w:tcPr>
+            <w:tcW w:type="dxa" w:w="5159"/>
+            <w:shd w:val="clear" w:color="auto" w:fill="EEF4F7"/>
+            <w:tcMar>
+              <w:top w:w="70" w:type="dxa"/>
+              <w:left w:w="90" w:type="dxa"/>
+              <w:bottom w:w="70" w:type="dxa"/>
+              <w:right w:w="70" w:type="dxa"/>
+            </w:tcMar>
+            <w:tcBorders>
+              <w:top w:val="nil" w:sz="0" w:space="0" w:color="auto"/>
+              <w:left w:val="single" w:sz="24" w:space="0" w:color="C4A35A"/>
+              <w:bottom w:val="nil" w:sz="0" w:space="0" w:color="auto"/>
+              <w:right w:val="nil" w:sz="0" w:space="0" w:color="auto"/>
+            </w:tcBorders>
+          </w:tcPr>
+          <w:p>
+            <w:pPr>
+              <w:spacing w:before="0" w:after="40" w:line="220" w:lineRule="auto"/>
+              <w:jc w:val="left"/>
+            </w:pPr>
+            <w:r>
+              <w:rPr>
+                <w:rFonts w:ascii="Calibri" w:hAnsi="Calibri" w:eastAsia="Calibri"/>
+                <w:b/>
+                <w:i w:val="0"/>
+                <w:color w:val="0F2C3C"/>
+                <w:sz w:val="20"/>
+              </w:rPr>
+              <w:t>Procurement &amp; Purchasing</w:t>
+            </w:r>
+          </w:p>
+          <w:p>
+            <w:pPr>
+              <w:spacing w:before="0" w:after="40" w:line="220" w:lineRule="auto"/>
+              <w:jc w:val="left"/>
+            </w:pPr>
+            <w:r>
+              <w:rPr>
+                <w:rFonts w:ascii="Calibri" w:hAnsi="Calibri" w:eastAsia="Calibri"/>
+                <w:b w:val="0"/>
+                <w:i w:val="0"/>
+                <w:color w:val="2C2C2C"/>
+                <w:sz w:val="18"/>
+              </w:rPr>
+              <w:t>Procurement and Purchasing; Supplier Sourcing; Supplier Coordination; Supplier Negotiation; Quotation Comparison; Material Sourcing; Purchase Coordination; Cost Calculation; Cost Control; Delivery Coordination</w:t>
+            </w:r>
+          </w:p>
+        </w:tc>
+      </w:tr>
+      <w:tr>
+        <w:tc>
+          <w:tcPr>
+            <w:tcW w:type="dxa" w:w="5159"/>
+            <w:shd w:val="clear" w:color="auto" w:fill="EEF4F7"/>
+            <w:tcMar>
+              <w:top w:w="70" w:type="dxa"/>
+              <w:left w:w="90" w:type="dxa"/>
+              <w:bottom w:w="70" w:type="dxa"/>
+              <w:right w:w="70" w:type="dxa"/>
+            </w:tcMar>
+            <w:tcBorders>
+              <w:top w:val="nil" w:sz="0" w:space="0" w:color="auto"/>
+              <w:left w:val="single" w:sz="24" w:space="0" w:color="C4A35A"/>
+              <w:bottom w:val="nil" w:sz="0" w:space="0" w:color="auto"/>
+              <w:right w:val="nil" w:sz="0" w:space="0" w:color="auto"/>
+            </w:tcBorders>
+          </w:tcPr>
+          <w:p>
+            <w:pPr>
+              <w:spacing w:before="0" w:after="40" w:line="220" w:lineRule="auto"/>
+              <w:jc w:val="left"/>
+            </w:pPr>
+            <w:r>
+              <w:rPr>
+                <w:rFonts w:ascii="Calibri" w:hAnsi="Calibri" w:eastAsia="Calibri"/>
+                <w:b/>
+                <w:i w:val="0"/>
+                <w:color w:val="0F2C3C"/>
+                <w:sz w:val="20"/>
+              </w:rPr>
+              <w:t>Project &amp; Operations</w:t>
+            </w:r>
+          </w:p>
+          <w:p>
+            <w:pPr>
+              <w:spacing w:before="0" w:after="40" w:line="220" w:lineRule="auto"/>
+              <w:jc w:val="left"/>
+            </w:pPr>
+            <w:r>
+              <w:rPr>
+                <w:rFonts w:ascii="Calibri" w:hAnsi="Calibri" w:eastAsia="Calibri"/>
+                <w:b w:val="0"/>
+                <w:i w:val="0"/>
+                <w:color w:val="2C2C2C"/>
+                <w:sz w:val="18"/>
+              </w:rPr>
+              <w:t>Project Initiation; Project Coordination; Project Scheduling; Daily Work Planning; Workforce Coordination; Staff Supervision; Task Allocation; Deadline Management; Material Planning; Operational Coordination</w:t>
+            </w:r>
+          </w:p>
+        </w:tc>
+        <w:tc>
+          <w:tcPr>
+            <w:tcW w:type="dxa" w:w="5159"/>
+            <w:shd w:val="clear" w:color="auto" w:fill="EEF4F7"/>
+            <w:tcMar>
+              <w:top w:w="70" w:type="dxa"/>
+              <w:left w:w="90" w:type="dxa"/>
+              <w:bottom w:w="70" w:type="dxa"/>
+              <w:right w:w="70" w:type="dxa"/>
+            </w:tcMar>
+            <w:tcBorders>
+              <w:top w:val="nil" w:sz="0" w:space="0" w:color="auto"/>
+              <w:left w:val="single" w:sz="24" w:space="0" w:color="C4A35A"/>
+              <w:bottom w:val="nil" w:sz="0" w:space="0" w:color="auto"/>
+              <w:right w:val="nil" w:sz="0" w:space="0" w:color="auto"/>
+            </w:tcBorders>
+          </w:tcPr>
+          <w:p>
+            <w:pPr>
+              <w:spacing w:before="0" w:after="40" w:line="220" w:lineRule="auto"/>
+              <w:jc w:val="left"/>
+            </w:pPr>
+            <w:r>
+              <w:rPr>
+                <w:rFonts w:ascii="Calibri" w:hAnsi="Calibri" w:eastAsia="Calibri"/>
+                <w:b/>
+                <w:i w:val="0"/>
+                <w:color w:val="0F2C3C"/>
+                <w:sz w:val="20"/>
+              </w:rPr>
+              <w:t>Client &amp; Business Coordination</w:t>
+            </w:r>
+          </w:p>
+          <w:p>
+            <w:pPr>
+              <w:spacing w:before="0" w:after="40" w:line="220" w:lineRule="auto"/>
+              <w:jc w:val="left"/>
+            </w:pPr>
+            <w:r>
+              <w:rPr>
+                <w:rFonts w:ascii="Calibri" w:hAnsi="Calibri" w:eastAsia="Calibri"/>
+                <w:b w:val="0"/>
+                <w:i w:val="0"/>
+                <w:color w:val="2C2C2C"/>
+                <w:sz w:val="18"/>
+              </w:rPr>
+              <w:t>RFQ Management; Quotation Preparation; Pricing; LPO Processing; Client Requirement Gathering; Client Communication; Hotel Client Coordination; Meeting and Site Visit Coordination; Cross-functional Coordination; Project Documentation</w:t>
+            </w:r>
+          </w:p>
+        </w:tc>
+      </w:tr>
+    </w:tbl>
+    <w:p>
+      <w:pPr>
+        <w:spacing w:before="120" w:after="40" w:line="200" w:lineRule="auto"/>
+      </w:pPr>
+    </w:p>
+    <w:tbl>
+      <w:tblPr>
+        <w:tblW w:type="pct" w:w="5000"/>
+        <w:tblLayout w:type="autofit"/>
+        <w:tblLook w:firstColumn="1" w:firstRow="1" w:lastColumn="0" w:lastRow="0" w:noHBand="0" w:noVBand="1" w:val="04A0"/>
+        <w:tblInd w:w="0" w:type="dxa"/>
+        <w:tblBorders>
+          <w:top w:val="nil" w:sz="0" w:space="0" w:color="auto"/>
+          <w:left w:val="nil" w:sz="0" w:space="0" w:color="auto"/>
+          <w:bottom w:val="nil" w:sz="0" w:space="0" w:color="auto"/>
+          <w:right w:val="nil" w:sz="0" w:space="0" w:color="auto"/>
+          <w:insideH w:val="nil" w:sz="0" w:space="0" w:color="auto"/>
+          <w:insideV w:val="nil" w:sz="0" w:space="0" w:color="auto"/>
+        </w:tblBorders>
+      </w:tblPr>
+      <w:tblGrid>
+        <w:gridCol w:w="10318"/>
+      </w:tblGrid>
+      <w:tr>
+        <w:tc>
+          <w:tcPr>
+            <w:tcW w:type="dxa" w:w="10318"/>
+            <w:shd w:val="clear" w:color="auto" w:fill="0F2C3C"/>
+            <w:tcMar>
+              <w:top w:w="50" w:type="dxa"/>
+              <w:left w:w="120" w:type="dxa"/>
+              <w:bottom w:w="50" w:type="dxa"/>
+              <w:right w:w="80" w:type="dxa"/>
+            </w:tcMar>
+            <w:tcBorders>
+              <w:top w:val="nil" w:sz="0" w:space="0" w:color="auto"/>
+              <w:left w:val="single" w:sz="24" w:space="0" w:color="C4A35A"/>
+              <w:bottom w:val="nil" w:sz="0" w:space="0" w:color="auto"/>
+              <w:right w:val="nil" w:sz="0" w:space="0" w:color="auto"/>
+            </w:tcBorders>
+          </w:tcPr>
+          <w:p>
+            <w:pPr>
+              <w:spacing w:before="0" w:after="0" w:line="220" w:lineRule="auto"/>
+              <w:jc w:val="left"/>
+            </w:pPr>
+            <w:r>
+              <w:rPr>
+                <w:rFonts w:ascii="Calibri" w:hAnsi="Calibri" w:eastAsia="Calibri"/>
+                <w:b/>
+                <w:i w:val="0"/>
+                <w:color w:val="FFFFFF"/>
+                <w:sz w:val="20"/>
+              </w:rPr>
+              <w:t>PROFESSIONAL EXPERIENCE</w:t>
+            </w:r>
+          </w:p>
+        </w:tc>
+      </w:tr>
+    </w:tbl>
+    <w:p>
+      <w:pPr>
+        <w:spacing w:before="40" w:after="40" w:line="200" w:lineRule="auto"/>
+      </w:pPr>
+    </w:p>
+    <w:tbl>
+      <w:tblPr>
+        <w:tblW w:type="pct" w:w="5000"/>
+        <w:tblLayout w:type="autofit"/>
+        <w:tblLook w:firstColumn="1" w:firstRow="1" w:lastColumn="0" w:lastRow="0" w:noHBand="0" w:noVBand="1" w:val="04A0"/>
+        <w:tblInd w:w="0" w:type="dxa"/>
+        <w:tblBorders>
+          <w:top w:val="nil" w:sz="0" w:space="0" w:color="auto"/>
+          <w:left w:val="nil" w:sz="0" w:space="0" w:color="auto"/>
+          <w:bottom w:val="nil" w:sz="0" w:space="0" w:color="auto"/>
+          <w:right w:val="nil" w:sz="0" w:space="0" w:color="auto"/>
+          <w:insideH w:val="nil" w:sz="0" w:space="0" w:color="auto"/>
+          <w:insideV w:val="nil" w:sz="0" w:space="0" w:color="auto"/>
+        </w:tblBorders>
+      </w:tblPr>
+      <w:tblGrid>
+        <w:gridCol w:w="5159"/>
+        <w:gridCol w:w="5159"/>
+      </w:tblGrid>
+      <w:tr>
+        <w:tc>
+          <w:tcPr>
+            <w:tcW w:type="dxa" w:w="5159"/>
+            <w:tcMar>
+              <w:top w:w="40" w:type="dxa"/>
+              <w:left w:w="0" w:type="dxa"/>
+              <w:bottom w:w="20" w:type="dxa"/>
+              <w:right w:w="40" w:type="dxa"/>
+            </w:tcMar>
+            <w:tcBorders>
+              <w:top w:val="nil" w:sz="0" w:space="0" w:color="auto"/>
+              <w:left w:val="nil" w:sz="0" w:space="0" w:color="auto"/>
+              <w:bottom w:val="single" w:sz="6" w:space="0" w:color="D9D2C5"/>
+              <w:right w:val="nil" w:sz="0" w:space="0" w:color="auto"/>
+            </w:tcBorders>
+          </w:tcPr>
+          <w:p>
+            <w:pPr>
+              <w:spacing w:before="0" w:after="0" w:line="220" w:lineRule="auto"/>
+              <w:jc w:val="left"/>
+            </w:pPr>
+            <w:r>
+              <w:rPr>
+                <w:rFonts w:ascii="Calibri" w:hAnsi="Calibri" w:eastAsia="Calibri"/>
+                <w:b/>
+                <w:i w:val="0"/>
+                <w:color w:val="0F2C3C"/>
+                <w:sz w:val="22"/>
+              </w:rPr>
+              <w:t>INTROYALE INTERIORS LLC — Abu Dhabi, UAE</w:t>
+            </w:r>
+          </w:p>
+        </w:tc>
+        <w:tc>
+          <w:tcPr>
+            <w:tcW w:type="dxa" w:w="5159"/>
+            <w:tcMar>
+              <w:top w:w="40" w:type="dxa"/>
+              <w:left w:w="40" w:type="dxa"/>
+              <w:bottom w:w="20" w:type="dxa"/>
+              <w:right w:w="0" w:type="dxa"/>
+            </w:tcMar>
+            <w:tcBorders>
+              <w:top w:val="nil" w:sz="0" w:space="0" w:color="auto"/>
+              <w:left w:val="nil" w:sz="0" w:space="0" w:color="auto"/>
+              <w:bottom w:val="single" w:sz="6" w:space="0" w:color="D9D2C5"/>
+              <w:right w:val="nil" w:sz="0" w:space="0" w:color="auto"/>
+            </w:tcBorders>
+          </w:tcPr>
+          <w:p>
+            <w:pPr>
+              <w:spacing w:before="0" w:after="0" w:line="220" w:lineRule="auto"/>
+              <w:jc w:val="right"/>
+            </w:pPr>
+            <w:r>
+              <w:rPr>
+                <w:rFonts w:ascii="Calibri" w:hAnsi="Calibri" w:eastAsia="Calibri"/>
+                <w:b/>
+                <w:i w:val="0"/>
+                <w:color w:val="8A7040"/>
+                <w:sz w:val="20"/>
+              </w:rPr>
+              <w:t>27 Oct 2023 – 16 May 2026</w:t>
+            </w:r>
+          </w:p>
+        </w:tc>
+      </w:tr>
+    </w:tbl>
+    <w:p>
+      <w:pPr>
+        <w:spacing w:before="40" w:after="0" w:line="220" w:lineRule="auto"/>
       </w:pPr>
       <w:r>
         <w:rPr>
           <w:rFonts w:ascii="Calibri" w:hAnsi="Calibri" w:eastAsia="Calibri"/>
           <w:b/>
-          <w:color w:val="FFFFFF"/>
-          <w:sz w:val="22"/>
+          <w:i w:val="0"/>
+          <w:color w:val="3D5A68"/>
+          <w:sz w:val="20"/>
         </w:rPr>
-        <w:t xml:space="preserve">  CORE SKILLS  </w:t>
+        <w:t>Accountant → Expanded Operations, Procurement &amp; Project Responsibilities</w:t>
       </w:r>
     </w:p>
     <w:p>
       <w:pPr>
-        <w:spacing w:before="0" w:after="60" w:line="230" w:lineRule="auto"/>
-      </w:pPr>
-      <w:r>
-        <w:rPr>
-          <w:rFonts w:ascii="Calibri" w:hAnsi="Calibri" w:eastAsia="Calibri"/>
-          <w:b/>
-          <w:sz w:val="21"/>
-        </w:rPr>
-        <w:t xml:space="preserve">Accounting &amp; Finance: </w:t>
-      </w:r>
-      <w:r>
-        <w:rPr>
-          <w:rFonts w:ascii="Calibri" w:hAnsi="Calibri" w:eastAsia="Calibri"/>
-          <w:b w:val="0"/>
-          <w:sz w:val="21"/>
-        </w:rPr>
-        <w:t>Accounting and Bookkeeping; Accounts Payable (AP); Accounts Receivable (AR); Purchase and Sales Entries; Invoicing and Billing; Receivables Follow-up; Payment Follow-up; Financial Documentation; VAT Preparation and Filing</w:t>
-      </w:r>
-    </w:p>
-    <w:p>
-      <w:pPr>
-        <w:spacing w:before="0" w:after="60" w:line="230" w:lineRule="auto"/>
-      </w:pPr>
-      <w:r>
-        <w:rPr>
-          <w:rFonts w:ascii="Calibri" w:hAnsi="Calibri" w:eastAsia="Calibri"/>
-          <w:b/>
-          <w:sz w:val="21"/>
-        </w:rPr>
-        <w:t xml:space="preserve">Procurement &amp; Purchasing: </w:t>
-      </w:r>
-      <w:r>
-        <w:rPr>
-          <w:rFonts w:ascii="Calibri" w:hAnsi="Calibri" w:eastAsia="Calibri"/>
-          <w:b w:val="0"/>
-          <w:sz w:val="21"/>
-        </w:rPr>
-        <w:t>Procurement and Purchasing; Supplier Sourcing; Supplier Coordination; Supplier Negotiation; Quotation Comparison; Material Sourcing; Purchase Coordination; Cost Calculation; Cost Control; Delivery Coordination</w:t>
-      </w:r>
-    </w:p>
-    <w:p>
-      <w:pPr>
-        <w:spacing w:before="0" w:after="60" w:line="230" w:lineRule="auto"/>
-      </w:pPr>
-      <w:r>
-        <w:rPr>
-          <w:rFonts w:ascii="Calibri" w:hAnsi="Calibri" w:eastAsia="Calibri"/>
-          <w:b/>
-          <w:sz w:val="21"/>
-        </w:rPr>
-        <w:t xml:space="preserve">Project &amp; Operations: </w:t>
-      </w:r>
-      <w:r>
-        <w:rPr>
-          <w:rFonts w:ascii="Calibri" w:hAnsi="Calibri" w:eastAsia="Calibri"/>
-          <w:b w:val="0"/>
-          <w:sz w:val="21"/>
-        </w:rPr>
-        <w:t>Project Initiation; Project Coordination; Project Scheduling; Daily Work Planning; Workforce Coordination; Staff Supervision; Task Allocation; Deadline Management; Material Planning; Operational Coordination</w:t>
-      </w:r>
-    </w:p>
-    <w:p>
-      <w:pPr>
-        <w:spacing w:before="0" w:after="60" w:line="230" w:lineRule="auto"/>
-      </w:pPr>
-      <w:r>
-        <w:rPr>
-          <w:rFonts w:ascii="Calibri" w:hAnsi="Calibri" w:eastAsia="Calibri"/>
-          <w:b/>
-          <w:sz w:val="21"/>
-        </w:rPr>
-        <w:t xml:space="preserve">Client &amp; Business Coordination: </w:t>
-      </w:r>
-      <w:r>
-        <w:rPr>
-          <w:rFonts w:ascii="Calibri" w:hAnsi="Calibri" w:eastAsia="Calibri"/>
-          <w:b w:val="0"/>
-          <w:sz w:val="21"/>
-        </w:rPr>
-        <w:t>RFQ Management; Quotation Preparation; Pricing; LPO Processing; Client Requirement Gathering; Client Communication; Hotel Client Coordination; Meeting and Site Visit Coordination; Cross-functional Coordination; Project Documentation</w:t>
-      </w:r>
-    </w:p>
-    <w:p>
-      <w:pPr>
-        <w:spacing w:before="200" w:after="120" w:line="240" w:lineRule="auto"/>
-        <w:shd w:val="clear" w:color="auto" w:fill="0F2C3C"/>
-      </w:pPr>
-      <w:r>
-        <w:rPr>
-          <w:rFonts w:ascii="Calibri" w:hAnsi="Calibri" w:eastAsia="Calibri"/>
-          <w:b/>
-          <w:color w:val="FFFFFF"/>
-          <w:sz w:val="22"/>
-        </w:rPr>
-        <w:t xml:space="preserve">  PROFESSIONAL EXPERIENCE  </w:t>
-      </w:r>
-    </w:p>
-    <w:p>
-      <w:pPr>
-        <w:tabs>
-          <w:tab w:pos="10224" w:val="right"/>
-        </w:tabs>
-        <w:spacing w:before="120" w:after="0" w:line="230" w:lineRule="auto"/>
-      </w:pPr>
-      <w:r>
-        <w:rPr>
-          <w:rFonts w:ascii="Calibri" w:hAnsi="Calibri" w:eastAsia="Calibri"/>
-          <w:b/>
-          <w:color w:val="0F2C3C"/>
-          <w:sz w:val="22"/>
-        </w:rPr>
-        <w:t>INTROYALE INTERIORS LLC  —  Abu Dhabi, United Arab Emirates</w:t>
-      </w:r>
-      <w:r>
-        <w:rPr>
-          <w:rFonts w:ascii="Calibri" w:hAnsi="Calibri" w:eastAsia="Calibri"/>
-          <w:b/>
-          <w:color w:val="C4A35A"/>
-          <w:sz w:val="21"/>
-        </w:rPr>
-        <w:tab/>
-        <w:t>27 Oct 2023 – 16 May 2026</w:t>
-      </w:r>
-    </w:p>
-    <w:p>
-      <w:pPr>
-        <w:spacing w:before="0" w:after="20" w:line="230" w:lineRule="auto"/>
-      </w:pPr>
-      <w:r>
-        <w:rPr>
-          <w:rFonts w:ascii="Calibri" w:hAnsi="Calibri" w:eastAsia="Calibri"/>
-          <w:b/>
-          <w:sz w:val="21"/>
-        </w:rPr>
-        <w:t>Accountant  →  Expanded Operations, Procurement &amp; Project Responsibilities</w:t>
-      </w:r>
-    </w:p>
-    <w:p>
-      <w:pPr>
-        <w:spacing w:before="0" w:after="60" w:line="230" w:lineRule="auto"/>
+        <w:spacing w:before="0" w:after="80" w:line="220" w:lineRule="auto"/>
       </w:pPr>
       <w:r>
         <w:rPr>
           <w:rFonts w:ascii="Calibri" w:hAnsi="Calibri" w:eastAsia="Calibri"/>
           <w:b w:val="0"/>
-          <w:sz w:val="20"/>
+          <w:i/>
+          <w:color w:val="5A6570"/>
+          <w:sz w:val="19"/>
         </w:rPr>
         <w:t>Industry: Interior Fit-Out / Hotel Projects</w:t>
       </w:r>
     </w:p>
     <w:p>
       <w:pPr>
-        <w:spacing w:before="40" w:after="40" w:line="230" w:lineRule="auto"/>
+        <w:spacing w:before="120" w:after="40" w:line="220" w:lineRule="auto"/>
       </w:pPr>
       <w:r>
         <w:rPr>
           <w:rFonts w:ascii="Calibri" w:hAnsi="Calibri" w:eastAsia="Calibri"/>
           <w:b/>
+          <w:i w:val="0"/>
           <w:color w:val="0F2C3C"/>
           <w:sz w:val="21"/>
         </w:rPr>
@@ -376,82 +1018,93 @@
     </w:p>
     <w:p>
       <w:pPr>
-        <w:spacing w:before="0" w:after="40" w:line="220" w:lineRule="auto"/>
-        <w:ind w:left="288" w:hanging="216"/>
+        <w:spacing w:before="0" w:after="20" w:line="216" w:lineRule="auto"/>
+        <w:ind w:left="255" w:hanging="198"/>
       </w:pPr>
       <w:r>
         <w:rPr>
           <w:rFonts w:ascii="Calibri" w:hAnsi="Calibri" w:eastAsia="Calibri"/>
           <w:b w:val="0"/>
-          <w:sz w:val="21"/>
+          <w:i w:val="0"/>
+          <w:color w:val="2C2C2C"/>
+          <w:sz w:val="20"/>
         </w:rPr>
-        <w:t>• Managed day-to-day accounting activities including purchase entries, sales entries, accounts payable (AP), and accounts receivable (AR).</w:t>
+        <w:t>•  Managed day-to-day accounting activities including purchase entries, sales entries, accounts payable (AP), and accounts receivable (AR).</w:t>
       </w:r>
     </w:p>
     <w:p>
       <w:pPr>
-        <w:spacing w:before="0" w:after="40" w:line="220" w:lineRule="auto"/>
-        <w:ind w:left="288" w:hanging="216"/>
+        <w:spacing w:before="0" w:after="20" w:line="216" w:lineRule="auto"/>
+        <w:ind w:left="255" w:hanging="198"/>
       </w:pPr>
       <w:r>
         <w:rPr>
           <w:rFonts w:ascii="Calibri" w:hAnsi="Calibri" w:eastAsia="Calibri"/>
           <w:b w:val="0"/>
-          <w:sz w:val="21"/>
+          <w:i w:val="0"/>
+          <w:color w:val="2C2C2C"/>
+          <w:sz w:val="20"/>
         </w:rPr>
-        <w:t>• Recorded and maintained financial transactions and supporting documentation required for financial and operational activities.</w:t>
+        <w:t>•  Recorded and maintained financial transactions and supporting documentation required for financial and operational activities.</w:t>
       </w:r>
     </w:p>
     <w:p>
       <w:pPr>
-        <w:spacing w:before="0" w:after="40" w:line="220" w:lineRule="auto"/>
-        <w:ind w:left="288" w:hanging="216"/>
+        <w:spacing w:before="0" w:after="20" w:line="216" w:lineRule="auto"/>
+        <w:ind w:left="255" w:hanging="198"/>
       </w:pPr>
       <w:r>
         <w:rPr>
           <w:rFonts w:ascii="Calibri" w:hAnsi="Calibri" w:eastAsia="Calibri"/>
           <w:b w:val="0"/>
-          <w:sz w:val="21"/>
+          <w:i w:val="0"/>
+          <w:color w:val="2C2C2C"/>
+          <w:sz w:val="20"/>
         </w:rPr>
-        <w:t>• Prepared invoices, maintained billing records, monitored customer outstanding balances, and followed up with clients on receivables by email and telephone.</w:t>
+        <w:t>•  Prepared invoices, maintained billing records, monitored customer outstanding balances, and followed up with clients on receivables by email and telephone.</w:t>
       </w:r>
     </w:p>
     <w:p>
       <w:pPr>
-        <w:spacing w:before="0" w:after="40" w:line="220" w:lineRule="auto"/>
-        <w:ind w:left="288" w:hanging="216"/>
+        <w:spacing w:before="0" w:after="20" w:line="216" w:lineRule="auto"/>
+        <w:ind w:left="255" w:hanging="198"/>
       </w:pPr>
       <w:r>
         <w:rPr>
           <w:rFonts w:ascii="Calibri" w:hAnsi="Calibri" w:eastAsia="Calibri"/>
           <w:b w:val="0"/>
-          <w:sz w:val="21"/>
+          <w:i w:val="0"/>
+          <w:color w:val="2C2C2C"/>
+          <w:sz w:val="20"/>
         </w:rPr>
-        <w:t>• Prepared VAT-related records and handled VAT preparation and filing activities.</w:t>
+        <w:t>•  Prepared VAT-related records and handled VAT preparation and filing activities.</w:t>
       </w:r>
     </w:p>
     <w:p>
       <w:pPr>
-        <w:spacing w:before="0" w:after="40" w:line="220" w:lineRule="auto"/>
-        <w:ind w:left="288" w:hanging="216"/>
+        <w:spacing w:before="0" w:after="20" w:line="216" w:lineRule="auto"/>
+        <w:ind w:left="255" w:hanging="198"/>
       </w:pPr>
       <w:r>
         <w:rPr>
           <w:rFonts w:ascii="Calibri" w:hAnsi="Calibri" w:eastAsia="Calibri"/>
           <w:b w:val="0"/>
-          <w:sz w:val="21"/>
+          <w:i w:val="0"/>
+          <w:color w:val="2C2C2C"/>
+          <w:sz w:val="20"/>
         </w:rPr>
-        <w:t>• Coordinated financial follow-ups connected with ongoing business and project activities.</w:t>
+        <w:t>•  Coordinated financial follow-ups connected with ongoing business and project activities.</w:t>
       </w:r>
     </w:p>
     <w:p>
       <w:pPr>
-        <w:spacing w:before="80" w:after="40" w:line="230" w:lineRule="auto"/>
+        <w:spacing w:before="120" w:after="40" w:line="220" w:lineRule="auto"/>
       </w:pPr>
       <w:r>
         <w:rPr>
           <w:rFonts w:ascii="Calibri" w:hAnsi="Calibri" w:eastAsia="Calibri"/>
           <w:b/>
+          <w:i w:val="0"/>
           <w:color w:val="0F2C3C"/>
           <w:sz w:val="21"/>
         </w:rPr>
@@ -460,54 +1113,61 @@
     </w:p>
     <w:p>
       <w:pPr>
-        <w:spacing w:before="0" w:after="40" w:line="220" w:lineRule="auto"/>
-        <w:ind w:left="288" w:hanging="216"/>
+        <w:spacing w:before="0" w:after="20" w:line="216" w:lineRule="auto"/>
+        <w:ind w:left="255" w:hanging="198"/>
       </w:pPr>
       <w:r>
         <w:rPr>
           <w:rFonts w:ascii="Calibri" w:hAnsi="Calibri" w:eastAsia="Calibri"/>
           <w:b w:val="0"/>
-          <w:sz w:val="21"/>
+          <w:i w:val="0"/>
+          <w:color w:val="2C2C2C"/>
+          <w:sz w:val="20"/>
         </w:rPr>
-        <w:t>• Managed the quotation workflow from client RFQ receipt through requirement review, site visits, hotel client meetings, quotation submission, follow-up, and approval.</w:t>
+        <w:t>•  Managed the quotation workflow from client RFQ receipt through requirement review, site visits, hotel client meetings, quotation submission, follow-up, and approval.</w:t>
       </w:r>
     </w:p>
     <w:p>
       <w:pPr>
-        <w:spacing w:before="0" w:after="40" w:line="220" w:lineRule="auto"/>
-        <w:ind w:left="288" w:hanging="216"/>
+        <w:spacing w:before="0" w:after="20" w:line="216" w:lineRule="auto"/>
+        <w:ind w:left="255" w:hanging="198"/>
       </w:pPr>
       <w:r>
         <w:rPr>
           <w:rFonts w:ascii="Calibri" w:hAnsi="Calibri" w:eastAsia="Calibri"/>
           <w:b w:val="0"/>
-          <w:sz w:val="21"/>
+          <w:i w:val="0"/>
+          <w:color w:val="2C2C2C"/>
+          <w:sz w:val="20"/>
         </w:rPr>
-        <w:t>• Prepared quotations and calculated project pricing based on requirements, materials, labour, and related costs; coordinated with purchasing teams and suppliers for material information and pricing.</w:t>
+        <w:t>•  Prepared quotations and calculated project pricing based on requirements, materials, labour, and related costs; coordinated with purchasing teams and suppliers for material information and pricing.</w:t>
       </w:r>
     </w:p>
     <w:p>
       <w:pPr>
-        <w:spacing w:before="0" w:after="40" w:line="220" w:lineRule="auto"/>
-        <w:ind w:left="288" w:hanging="216"/>
+        <w:spacing w:before="0" w:after="20" w:line="216" w:lineRule="auto"/>
+        <w:ind w:left="255" w:hanging="198"/>
       </w:pPr>
       <w:r>
         <w:rPr>
           <w:rFonts w:ascii="Calibri" w:hAnsi="Calibri" w:eastAsia="Calibri"/>
           <w:b w:val="0"/>
-          <w:sz w:val="21"/>
+          <w:i w:val="0"/>
+          <w:color w:val="2C2C2C"/>
+          <w:sz w:val="20"/>
         </w:rPr>
-        <w:t>• Submitted quotations, followed up on clarifications and approvals, maintained client communication, processed approved LPOs, and initiated procurement and project execution.</w:t>
+        <w:t>•  Submitted quotations, followed up on clarifications and approvals, maintained client communication, processed approved LPOs, and initiated procurement and project execution.</w:t>
       </w:r>
     </w:p>
     <w:p>
       <w:pPr>
-        <w:spacing w:before="80" w:after="40" w:line="230" w:lineRule="auto"/>
+        <w:spacing w:before="120" w:after="40" w:line="220" w:lineRule="auto"/>
       </w:pPr>
       <w:r>
         <w:rPr>
           <w:rFonts w:ascii="Calibri" w:hAnsi="Calibri" w:eastAsia="Calibri"/>
           <w:b/>
+          <w:i w:val="0"/>
           <w:color w:val="0F2C3C"/>
           <w:sz w:val="21"/>
         </w:rPr>
@@ -516,68 +1176,77 @@
     </w:p>
     <w:p>
       <w:pPr>
-        <w:spacing w:before="0" w:after="40" w:line="220" w:lineRule="auto"/>
-        <w:ind w:left="288" w:hanging="216"/>
+        <w:spacing w:before="0" w:after="20" w:line="216" w:lineRule="auto"/>
+        <w:ind w:left="255" w:hanging="198"/>
       </w:pPr>
       <w:r>
         <w:rPr>
           <w:rFonts w:ascii="Calibri" w:hAnsi="Calibri" w:eastAsia="Calibri"/>
           <w:b w:val="0"/>
-          <w:sz w:val="21"/>
+          <w:i w:val="0"/>
+          <w:color w:val="2C2C2C"/>
+          <w:sz w:val="20"/>
         </w:rPr>
-        <w:t>• Managed material sourcing after receiving approved client LPOs and identified suppliers according to project requirements.</w:t>
+        <w:t>•  Managed material sourcing after receiving approved client LPOs and identified suppliers according to project requirements.</w:t>
       </w:r>
     </w:p>
     <w:p>
       <w:pPr>
-        <w:spacing w:before="0" w:after="40" w:line="220" w:lineRule="auto"/>
-        <w:ind w:left="288" w:hanging="216"/>
+        <w:spacing w:before="0" w:after="20" w:line="216" w:lineRule="auto"/>
+        <w:ind w:left="255" w:hanging="198"/>
       </w:pPr>
       <w:r>
         <w:rPr>
           <w:rFonts w:ascii="Calibri" w:hAnsi="Calibri" w:eastAsia="Calibri"/>
           <w:b w:val="0"/>
-          <w:sz w:val="21"/>
+          <w:i w:val="0"/>
+          <w:color w:val="2C2C2C"/>
+          <w:sz w:val="20"/>
         </w:rPr>
-        <w:t>• Obtained and compared supplier quotations; negotiated purchase prices and coordinated procurement according to project budgets and deadlines.</w:t>
+        <w:t>•  Obtained and compared supplier quotations; negotiated purchase prices and coordinated procurement according to project budgets and deadlines.</w:t>
       </w:r>
     </w:p>
     <w:p>
       <w:pPr>
-        <w:spacing w:before="0" w:after="40" w:line="220" w:lineRule="auto"/>
-        <w:ind w:left="288" w:hanging="216"/>
+        <w:spacing w:before="0" w:after="20" w:line="216" w:lineRule="auto"/>
+        <w:ind w:left="255" w:hanging="198"/>
       </w:pPr>
       <w:r>
         <w:rPr>
           <w:rFonts w:ascii="Calibri" w:hAnsi="Calibri" w:eastAsia="Calibri"/>
           <w:b w:val="0"/>
-          <w:sz w:val="21"/>
+          <w:i w:val="0"/>
+          <w:color w:val="2C2C2C"/>
+          <w:sz w:val="20"/>
         </w:rPr>
-        <w:t>• Calculated project-related costs, monitored expenses, and worked to minimize unnecessary expenditure while meeting project requirements.</w:t>
+        <w:t>•  Calculated project-related costs, monitored expenses, and worked to minimize unnecessary expenditure while meeting project requirements.</w:t>
       </w:r>
     </w:p>
     <w:p>
       <w:pPr>
-        <w:spacing w:before="0" w:after="40" w:line="220" w:lineRule="auto"/>
-        <w:ind w:left="288" w:hanging="216"/>
+        <w:spacing w:before="0" w:after="20" w:line="216" w:lineRule="auto"/>
+        <w:ind w:left="255" w:hanging="198"/>
       </w:pPr>
       <w:r>
         <w:rPr>
           <w:rFonts w:ascii="Calibri" w:hAnsi="Calibri" w:eastAsia="Calibri"/>
           <w:b w:val="0"/>
-          <w:sz w:val="21"/>
+          <w:i w:val="0"/>
+          <w:color w:val="2C2C2C"/>
+          <w:sz w:val="20"/>
         </w:rPr>
-        <w:t>• Coordinated purchasing and material delivery schedules with project deadlines and followed up with suppliers on availability, purchasing, and delivery.</w:t>
+        <w:t>•  Coordinated purchasing and material delivery schedules with project deadlines and followed up with suppliers on availability, purchasing, and delivery.</w:t>
       </w:r>
     </w:p>
     <w:p>
       <w:pPr>
-        <w:spacing w:before="80" w:after="40" w:line="230" w:lineRule="auto"/>
+        <w:spacing w:before="120" w:after="40" w:line="220" w:lineRule="auto"/>
       </w:pPr>
       <w:r>
         <w:rPr>
           <w:rFonts w:ascii="Calibri" w:hAnsi="Calibri" w:eastAsia="Calibri"/>
           <w:b/>
+          <w:i w:val="0"/>
           <w:color w:val="0F2C3C"/>
           <w:sz w:val="21"/>
         </w:rPr>
@@ -586,82 +1255,93 @@
     </w:p>
     <w:p>
       <w:pPr>
-        <w:spacing w:before="0" w:after="40" w:line="220" w:lineRule="auto"/>
-        <w:ind w:left="288" w:hanging="216"/>
+        <w:spacing w:before="0" w:after="20" w:line="216" w:lineRule="auto"/>
+        <w:ind w:left="255" w:hanging="198"/>
       </w:pPr>
       <w:r>
         <w:rPr>
           <w:rFonts w:ascii="Calibri" w:hAnsi="Calibri" w:eastAsia="Calibri"/>
           <w:b w:val="0"/>
-          <w:sz w:val="21"/>
+          <w:i w:val="0"/>
+          <w:color w:val="2C2C2C"/>
+          <w:sz w:val="20"/>
         </w:rPr>
-        <w:t>• Coordinated interior fit-out projects from initiation through execution, prioritizing approved LPOs according to client deadlines.</w:t>
+        <w:t>•  Coordinated interior fit-out projects from initiation through execution, prioritizing approved LPOs according to client deadlines.</w:t>
       </w:r>
     </w:p>
     <w:p>
       <w:pPr>
-        <w:spacing w:before="0" w:after="40" w:line="220" w:lineRule="auto"/>
-        <w:ind w:left="288" w:hanging="216"/>
+        <w:spacing w:before="0" w:after="20" w:line="216" w:lineRule="auto"/>
+        <w:ind w:left="255" w:hanging="198"/>
       </w:pPr>
       <w:r>
         <w:rPr>
           <w:rFonts w:ascii="Calibri" w:hAnsi="Calibri" w:eastAsia="Calibri"/>
           <w:b w:val="0"/>
-          <w:sz w:val="21"/>
+          <w:i w:val="0"/>
+          <w:color w:val="2C2C2C"/>
+          <w:sz w:val="20"/>
         </w:rPr>
-        <w:t>• Prepared project and workforce schedules; coordinated materials, staff, suppliers, and internal teams; and monitored ongoing and upcoming project requirements.</w:t>
+        <w:t>•  Prepared project and workforce schedules; coordinated materials, staff, suppliers, and internal teams; and monitored ongoing and upcoming project requirements.</w:t>
       </w:r>
     </w:p>
     <w:p>
       <w:pPr>
-        <w:spacing w:before="0" w:after="40" w:line="220" w:lineRule="auto"/>
-        <w:ind w:left="288" w:hanging="216"/>
+        <w:spacing w:before="0" w:after="20" w:line="216" w:lineRule="auto"/>
+        <w:ind w:left="255" w:hanging="198"/>
       </w:pPr>
       <w:r>
         <w:rPr>
           <w:rFonts w:ascii="Calibri" w:hAnsi="Calibri" w:eastAsia="Calibri"/>
           <w:b w:val="0"/>
-          <w:sz w:val="21"/>
+          <w:i w:val="0"/>
+          <w:color w:val="2C2C2C"/>
+          <w:sz w:val="20"/>
         </w:rPr>
-        <w:t>• Communicated with clients on progress, requirements, approvals, and schedules; attended meetings and coordinated between hotel representatives and internal teams.</w:t>
+        <w:t>•  Communicated with clients on progress, requirements, approvals, and schedules; attended meetings and coordinated between hotel representatives and internal teams.</w:t>
       </w:r>
     </w:p>
     <w:p>
       <w:pPr>
-        <w:spacing w:before="0" w:after="40" w:line="220" w:lineRule="auto"/>
-        <w:ind w:left="288" w:hanging="216"/>
+        <w:spacing w:before="0" w:after="20" w:line="216" w:lineRule="auto"/>
+        <w:ind w:left="255" w:hanging="198"/>
       </w:pPr>
       <w:r>
         <w:rPr>
           <w:rFonts w:ascii="Calibri" w:hAnsi="Calibri" w:eastAsia="Calibri"/>
           <w:b w:val="0"/>
-          <w:sz w:val="21"/>
+          <w:i w:val="0"/>
+          <w:color w:val="2C2C2C"/>
+          <w:sz w:val="20"/>
         </w:rPr>
-        <w:t>• Coordinated with purchasing managers, housekeeping managers, finance, operations, and engineering departments.</w:t>
+        <w:t>•  Coordinated with purchasing managers, housekeeping managers, finance, operations, and engineering departments.</w:t>
       </w:r>
     </w:p>
     <w:p>
       <w:pPr>
-        <w:spacing w:before="0" w:after="40" w:line="220" w:lineRule="auto"/>
-        <w:ind w:left="288" w:hanging="216"/>
+        <w:spacing w:before="0" w:after="20" w:line="216" w:lineRule="auto"/>
+        <w:ind w:left="255" w:hanging="198"/>
       </w:pPr>
       <w:r>
         <w:rPr>
           <w:rFonts w:ascii="Calibri" w:hAnsi="Calibri" w:eastAsia="Calibri"/>
           <w:b w:val="0"/>
-          <w:sz w:val="21"/>
+          <w:i w:val="0"/>
+          <w:color w:val="2C2C2C"/>
+          <w:sz w:val="20"/>
         </w:rPr>
-        <w:t>• Prepared daily work schedules, assigned tasks and deadlines, followed up on progress, and coordinated staff according to project priorities.</w:t>
+        <w:t>•  Prepared daily work schedules, assigned tasks and deadlines, followed up on progress, and coordinated staff according to project priorities.</w:t>
       </w:r>
     </w:p>
     <w:p>
       <w:pPr>
-        <w:spacing w:before="80" w:after="40" w:line="230" w:lineRule="auto"/>
+        <w:spacing w:before="120" w:after="40" w:line="220" w:lineRule="auto"/>
       </w:pPr>
       <w:r>
         <w:rPr>
           <w:rFonts w:ascii="Calibri" w:hAnsi="Calibri" w:eastAsia="Calibri"/>
           <w:b/>
+          <w:i w:val="0"/>
           <w:color w:val="0F2C3C"/>
           <w:sz w:val="21"/>
         </w:rPr>
@@ -670,249 +1350,765 @@
     </w:p>
     <w:p>
       <w:pPr>
-        <w:spacing w:before="0" w:after="40" w:line="220" w:lineRule="auto"/>
-        <w:ind w:left="288" w:hanging="216"/>
+        <w:spacing w:before="0" w:after="20" w:line="216" w:lineRule="auto"/>
+        <w:ind w:left="255" w:hanging="198"/>
       </w:pPr>
       <w:r>
         <w:rPr>
           <w:rFonts w:ascii="Calibri" w:hAnsi="Calibri" w:eastAsia="Calibri"/>
           <w:b w:val="0"/>
-          <w:sz w:val="21"/>
+          <w:i w:val="0"/>
+          <w:color w:val="2C2C2C"/>
+          <w:sz w:val="20"/>
         </w:rPr>
-        <w:t>• Expanded from Accountant into company-wide operations within approximately 5–6 months, handling day-to-day operational coordination alongside accounting.</w:t>
+        <w:t>•  Expanded from Accountant into company-wide operations within approximately 5–6 months, handling day-to-day operational coordination alongside accounting.</w:t>
       </w:r>
     </w:p>
     <w:p>
       <w:pPr>
-        <w:spacing w:before="0" w:after="40" w:line="220" w:lineRule="auto"/>
-        <w:ind w:left="288" w:hanging="216"/>
+        <w:spacing w:before="0" w:after="20" w:line="216" w:lineRule="auto"/>
+        <w:ind w:left="255" w:hanging="198"/>
       </w:pPr>
       <w:r>
         <w:rPr>
           <w:rFonts w:ascii="Calibri" w:hAnsi="Calibri" w:eastAsia="Calibri"/>
           <w:b w:val="0"/>
-          <w:sz w:val="21"/>
+          <w:i w:val="0"/>
+          <w:color w:val="2C2C2C"/>
+          <w:sz w:val="20"/>
         </w:rPr>
-        <w:t>• Supervised and coordinated approximately 25–30 staff, including daily schedules, work assignment, deadline communication, and workforce planning.</w:t>
+        <w:t>•  Supervised and coordinated approximately 25–30 staff, including daily schedules, work assignment, deadline communication, and workforce planning.</w:t>
       </w:r>
     </w:p>
     <w:p>
       <w:pPr>
-        <w:spacing w:before="0" w:after="40" w:line="220" w:lineRule="auto"/>
-        <w:ind w:left="288" w:hanging="216"/>
+        <w:spacing w:before="0" w:after="20" w:line="216" w:lineRule="auto"/>
+        <w:ind w:left="255" w:hanging="198"/>
       </w:pPr>
       <w:r>
         <w:rPr>
           <w:rFonts w:ascii="Calibri" w:hAnsi="Calibri" w:eastAsia="Calibri"/>
           <w:b w:val="0"/>
-          <w:sz w:val="21"/>
+          <w:i w:val="0"/>
+          <w:color w:val="2C2C2C"/>
+          <w:sz w:val="20"/>
         </w:rPr>
-        <w:t>• Supported HR-related staff management activities and acted as a key coordination point between management, staff, clients, suppliers, and project stakeholders.</w:t>
+        <w:t>•  Supported HR-related staff management activities and acted as a key coordination point between management, staff, clients, suppliers, and project stakeholders.</w:t>
       </w:r>
     </w:p>
     <w:p>
       <w:pPr>
-        <w:tabs>
-          <w:tab w:pos="10224" w:val="right"/>
-        </w:tabs>
-        <w:spacing w:before="120" w:after="0" w:line="230" w:lineRule="auto"/>
+        <w:spacing w:before="80" w:after="40" w:line="200" w:lineRule="auto"/>
       </w:pPr>
-      <w:r>
-        <w:rPr>
-          <w:rFonts w:ascii="Calibri" w:hAnsi="Calibri" w:eastAsia="Calibri"/>
-          <w:b/>
-          <w:color w:val="0F2C3C"/>
-          <w:sz w:val="22"/>
-        </w:rPr>
-        <w:t>TUBEES FOODS  —  Junior Accounts Assistant</w:t>
-      </w:r>
-      <w:r>
-        <w:rPr>
-          <w:rFonts w:ascii="Calibri" w:hAnsi="Calibri" w:eastAsia="Calibri"/>
-          <w:b/>
-          <w:color w:val="C4A35A"/>
-          <w:sz w:val="21"/>
-        </w:rPr>
-        <w:tab/>
-        <w:t>2022 – 2023</w:t>
-      </w:r>
     </w:p>
+    <w:tbl>
+      <w:tblPr>
+        <w:tblW w:type="pct" w:w="5000"/>
+        <w:tblLayout w:type="autofit"/>
+        <w:tblLook w:firstColumn="1" w:firstRow="1" w:lastColumn="0" w:lastRow="0" w:noHBand="0" w:noVBand="1" w:val="04A0"/>
+        <w:tblInd w:w="0" w:type="dxa"/>
+        <w:tblBorders>
+          <w:top w:val="nil" w:sz="0" w:space="0" w:color="auto"/>
+          <w:left w:val="nil" w:sz="0" w:space="0" w:color="auto"/>
+          <w:bottom w:val="nil" w:sz="0" w:space="0" w:color="auto"/>
+          <w:right w:val="nil" w:sz="0" w:space="0" w:color="auto"/>
+          <w:insideH w:val="nil" w:sz="0" w:space="0" w:color="auto"/>
+          <w:insideV w:val="nil" w:sz="0" w:space="0" w:color="auto"/>
+        </w:tblBorders>
+      </w:tblPr>
+      <w:tblGrid>
+        <w:gridCol w:w="5159"/>
+        <w:gridCol w:w="5159"/>
+      </w:tblGrid>
+      <w:tr>
+        <w:tc>
+          <w:tcPr>
+            <w:tcW w:type="dxa" w:w="5159"/>
+            <w:tcMar>
+              <w:top w:w="40" w:type="dxa"/>
+              <w:left w:w="0" w:type="dxa"/>
+              <w:bottom w:w="20" w:type="dxa"/>
+              <w:right w:w="40" w:type="dxa"/>
+            </w:tcMar>
+            <w:tcBorders>
+              <w:top w:val="nil" w:sz="0" w:space="0" w:color="auto"/>
+              <w:left w:val="nil" w:sz="0" w:space="0" w:color="auto"/>
+              <w:bottom w:val="single" w:sz="6" w:space="0" w:color="D9D2C5"/>
+              <w:right w:val="nil" w:sz="0" w:space="0" w:color="auto"/>
+            </w:tcBorders>
+          </w:tcPr>
+          <w:p>
+            <w:pPr>
+              <w:spacing w:before="0" w:after="0" w:line="220" w:lineRule="auto"/>
+              <w:jc w:val="left"/>
+            </w:pPr>
+            <w:r>
+              <w:rPr>
+                <w:rFonts w:ascii="Calibri" w:hAnsi="Calibri" w:eastAsia="Calibri"/>
+                <w:b/>
+                <w:i w:val="0"/>
+                <w:color w:val="0F2C3C"/>
+                <w:sz w:val="22"/>
+              </w:rPr>
+              <w:t>TUBEES FOODS — Junior Accounts Assistant</w:t>
+            </w:r>
+          </w:p>
+        </w:tc>
+        <w:tc>
+          <w:tcPr>
+            <w:tcW w:type="dxa" w:w="5159"/>
+            <w:tcMar>
+              <w:top w:w="40" w:type="dxa"/>
+              <w:left w:w="40" w:type="dxa"/>
+              <w:bottom w:w="20" w:type="dxa"/>
+              <w:right w:w="0" w:type="dxa"/>
+            </w:tcMar>
+            <w:tcBorders>
+              <w:top w:val="nil" w:sz="0" w:space="0" w:color="auto"/>
+              <w:left w:val="nil" w:sz="0" w:space="0" w:color="auto"/>
+              <w:bottom w:val="single" w:sz="6" w:space="0" w:color="D9D2C5"/>
+              <w:right w:val="nil" w:sz="0" w:space="0" w:color="auto"/>
+            </w:tcBorders>
+          </w:tcPr>
+          <w:p>
+            <w:pPr>
+              <w:spacing w:before="0" w:after="0" w:line="220" w:lineRule="auto"/>
+              <w:jc w:val="right"/>
+            </w:pPr>
+            <w:r>
+              <w:rPr>
+                <w:rFonts w:ascii="Calibri" w:hAnsi="Calibri" w:eastAsia="Calibri"/>
+                <w:b/>
+                <w:i w:val="0"/>
+                <w:color w:val="8A7040"/>
+                <w:sz w:val="20"/>
+              </w:rPr>
+              <w:t>2022 – 2023</w:t>
+            </w:r>
+          </w:p>
+        </w:tc>
+      </w:tr>
+    </w:tbl>
     <w:p>
       <w:pPr>
-        <w:spacing w:before="0" w:after="40" w:line="220" w:lineRule="auto"/>
-        <w:ind w:left="288" w:hanging="216"/>
+        <w:spacing w:before="0" w:after="20" w:line="216" w:lineRule="auto"/>
+        <w:ind w:left="255" w:hanging="198"/>
       </w:pPr>
       <w:r>
         <w:rPr>
           <w:rFonts w:ascii="Calibri" w:hAnsi="Calibri" w:eastAsia="Calibri"/>
           <w:b w:val="0"/>
-          <w:sz w:val="21"/>
+          <w:i w:val="0"/>
+          <w:color w:val="2C2C2C"/>
+          <w:sz w:val="20"/>
         </w:rPr>
-        <w:t>• Assisted with recording daily accounting transactions and maintaining financial records and accounting documentation.</w:t>
+        <w:t>•  Assisted with recording daily accounting transactions and maintaining financial records and accounting documentation.</w:t>
       </w:r>
     </w:p>
     <w:p>
       <w:pPr>
-        <w:spacing w:before="0" w:after="40" w:line="220" w:lineRule="auto"/>
-        <w:ind w:left="288" w:hanging="216"/>
+        <w:spacing w:before="0" w:after="20" w:line="216" w:lineRule="auto"/>
+        <w:ind w:left="255" w:hanging="198"/>
       </w:pPr>
       <w:r>
         <w:rPr>
           <w:rFonts w:ascii="Calibri" w:hAnsi="Calibri" w:eastAsia="Calibri"/>
           <w:b w:val="0"/>
-          <w:sz w:val="21"/>
+          <w:i w:val="0"/>
+          <w:color w:val="2C2C2C"/>
+          <w:sz w:val="20"/>
         </w:rPr>
-        <w:t>• Supported invoice preparation, payment follow-ups, and routine accounting and administrative activities.</w:t>
+        <w:t>•  Supported invoice preparation, payment follow-ups, and routine accounting and administrative activities.</w:t>
       </w:r>
     </w:p>
     <w:p>
       <w:pPr>
-        <w:spacing w:before="0" w:after="40" w:line="220" w:lineRule="auto"/>
-        <w:ind w:left="288" w:hanging="216"/>
+        <w:spacing w:before="0" w:after="20" w:line="216" w:lineRule="auto"/>
+        <w:ind w:left="255" w:hanging="198"/>
       </w:pPr>
       <w:r>
         <w:rPr>
           <w:rFonts w:ascii="Calibri" w:hAnsi="Calibri" w:eastAsia="Calibri"/>
           <w:b w:val="0"/>
-          <w:sz w:val="21"/>
+          <w:i w:val="0"/>
+          <w:color w:val="2C2C2C"/>
+          <w:sz w:val="20"/>
         </w:rPr>
-        <w:t>• Supported general office and operational requirements.</w:t>
+        <w:t>•  Supported general office and operational requirements.</w:t>
       </w:r>
     </w:p>
     <w:p>
       <w:pPr>
-        <w:spacing w:before="200" w:after="120" w:line="240" w:lineRule="auto"/>
-        <w:shd w:val="clear" w:color="auto" w:fill="0F2C3C"/>
+        <w:spacing w:before="120" w:after="40" w:line="200" w:lineRule="auto"/>
       </w:pPr>
-      <w:r>
-        <w:rPr>
-          <w:rFonts w:ascii="Calibri" w:hAnsi="Calibri" w:eastAsia="Calibri"/>
-          <w:b/>
-          <w:color w:val="FFFFFF"/>
-          <w:sz w:val="22"/>
-        </w:rPr>
-        <w:t xml:space="preserve">  EDUCATION  </w:t>
-      </w:r>
+    </w:p>
+    <w:tbl>
+      <w:tblPr>
+        <w:tblW w:type="pct" w:w="5000"/>
+        <w:tblLayout w:type="autofit"/>
+        <w:tblLook w:firstColumn="1" w:firstRow="1" w:lastColumn="0" w:lastRow="0" w:noHBand="0" w:noVBand="1" w:val="04A0"/>
+        <w:tblInd w:w="0" w:type="dxa"/>
+        <w:tblBorders>
+          <w:top w:val="nil" w:sz="0" w:space="0" w:color="auto"/>
+          <w:left w:val="nil" w:sz="0" w:space="0" w:color="auto"/>
+          <w:bottom w:val="nil" w:sz="0" w:space="0" w:color="auto"/>
+          <w:right w:val="nil" w:sz="0" w:space="0" w:color="auto"/>
+          <w:insideH w:val="nil" w:sz="0" w:space="0" w:color="auto"/>
+          <w:insideV w:val="nil" w:sz="0" w:space="0" w:color="auto"/>
+        </w:tblBorders>
+      </w:tblPr>
+      <w:tblGrid>
+        <w:gridCol w:w="10318"/>
+      </w:tblGrid>
+      <w:tr>
+        <w:tc>
+          <w:tcPr>
+            <w:tcW w:type="dxa" w:w="10318"/>
+            <w:shd w:val="clear" w:color="auto" w:fill="0F2C3C"/>
+            <w:tcMar>
+              <w:top w:w="50" w:type="dxa"/>
+              <w:left w:w="120" w:type="dxa"/>
+              <w:bottom w:w="50" w:type="dxa"/>
+              <w:right w:w="80" w:type="dxa"/>
+            </w:tcMar>
+            <w:tcBorders>
+              <w:top w:val="nil" w:sz="0" w:space="0" w:color="auto"/>
+              <w:left w:val="single" w:sz="24" w:space="0" w:color="C4A35A"/>
+              <w:bottom w:val="nil" w:sz="0" w:space="0" w:color="auto"/>
+              <w:right w:val="nil" w:sz="0" w:space="0" w:color="auto"/>
+            </w:tcBorders>
+          </w:tcPr>
+          <w:p>
+            <w:pPr>
+              <w:spacing w:before="0" w:after="0" w:line="220" w:lineRule="auto"/>
+              <w:jc w:val="left"/>
+            </w:pPr>
+            <w:r>
+              <w:rPr>
+                <w:rFonts w:ascii="Calibri" w:hAnsi="Calibri" w:eastAsia="Calibri"/>
+                <w:b/>
+                <w:i w:val="0"/>
+                <w:color w:val="FFFFFF"/>
+                <w:sz w:val="20"/>
+              </w:rPr>
+              <w:t>EDUCATION</w:t>
+            </w:r>
+          </w:p>
+        </w:tc>
+      </w:tr>
+    </w:tbl>
+    <w:p>
+      <w:pPr>
+        <w:spacing w:before="40" w:after="40" w:line="200" w:lineRule="auto"/>
+      </w:pPr>
+    </w:p>
+    <w:tbl>
+      <w:tblPr>
+        <w:tblW w:type="pct" w:w="5000"/>
+        <w:tblLayout w:type="autofit"/>
+        <w:tblLook w:firstColumn="1" w:firstRow="1" w:lastColumn="0" w:lastRow="0" w:noHBand="0" w:noVBand="1" w:val="04A0"/>
+        <w:tblInd w:w="0" w:type="dxa"/>
+        <w:tblBorders>
+          <w:top w:val="nil" w:sz="0" w:space="0" w:color="auto"/>
+          <w:left w:val="nil" w:sz="0" w:space="0" w:color="auto"/>
+          <w:bottom w:val="nil" w:sz="0" w:space="0" w:color="auto"/>
+          <w:right w:val="nil" w:sz="0" w:space="0" w:color="auto"/>
+          <w:insideH w:val="nil" w:sz="0" w:space="0" w:color="auto"/>
+          <w:insideV w:val="nil" w:sz="0" w:space="0" w:color="auto"/>
+        </w:tblBorders>
+      </w:tblPr>
+      <w:tblGrid>
+        <w:gridCol w:w="5159"/>
+        <w:gridCol w:w="5159"/>
+      </w:tblGrid>
+      <w:tr>
+        <w:tc>
+          <w:tcPr>
+            <w:tcW w:type="dxa" w:w="5159"/>
+            <w:tcMar>
+              <w:top w:w="40" w:type="dxa"/>
+              <w:left w:w="0" w:type="dxa"/>
+              <w:bottom w:w="20" w:type="dxa"/>
+              <w:right w:w="40" w:type="dxa"/>
+            </w:tcMar>
+            <w:tcBorders>
+              <w:top w:val="nil" w:sz="0" w:space="0" w:color="auto"/>
+              <w:left w:val="nil" w:sz="0" w:space="0" w:color="auto"/>
+              <w:bottom w:val="single" w:sz="6" w:space="0" w:color="D9D2C5"/>
+              <w:right w:val="nil" w:sz="0" w:space="0" w:color="auto"/>
+            </w:tcBorders>
+          </w:tcPr>
+          <w:p>
+            <w:pPr>
+              <w:spacing w:before="0" w:after="0" w:line="220" w:lineRule="auto"/>
+              <w:jc w:val="left"/>
+            </w:pPr>
+            <w:r>
+              <w:rPr>
+                <w:rFonts w:ascii="Calibri" w:hAnsi="Calibri" w:eastAsia="Calibri"/>
+                <w:b/>
+                <w:i w:val="0"/>
+                <w:color w:val="0F2C3C"/>
+                <w:sz w:val="22"/>
+              </w:rPr>
+              <w:t>UNIVERSITY OF CALICUT — Bachelor of Commerce (B.Com)</w:t>
+            </w:r>
+          </w:p>
+        </w:tc>
+        <w:tc>
+          <w:tcPr>
+            <w:tcW w:type="dxa" w:w="5159"/>
+            <w:tcMar>
+              <w:top w:w="40" w:type="dxa"/>
+              <w:left w:w="40" w:type="dxa"/>
+              <w:bottom w:w="20" w:type="dxa"/>
+              <w:right w:w="0" w:type="dxa"/>
+            </w:tcMar>
+            <w:tcBorders>
+              <w:top w:val="nil" w:sz="0" w:space="0" w:color="auto"/>
+              <w:left w:val="nil" w:sz="0" w:space="0" w:color="auto"/>
+              <w:bottom w:val="single" w:sz="6" w:space="0" w:color="D9D2C5"/>
+              <w:right w:val="nil" w:sz="0" w:space="0" w:color="auto"/>
+            </w:tcBorders>
+          </w:tcPr>
+          <w:p>
+            <w:pPr>
+              <w:spacing w:before="0" w:after="0" w:line="220" w:lineRule="auto"/>
+              <w:jc w:val="right"/>
+            </w:pPr>
+            <w:r>
+              <w:rPr>
+                <w:rFonts w:ascii="Calibri" w:hAnsi="Calibri" w:eastAsia="Calibri"/>
+                <w:b/>
+                <w:i w:val="0"/>
+                <w:color w:val="8A7040"/>
+                <w:sz w:val="20"/>
+              </w:rPr>
+              <w:t>2019 – 2021</w:t>
+            </w:r>
+          </w:p>
+        </w:tc>
+      </w:tr>
+    </w:tbl>
+    <w:tbl>
+      <w:tblPr>
+        <w:tblW w:type="pct" w:w="5000"/>
+        <w:tblLayout w:type="autofit"/>
+        <w:tblLook w:firstColumn="1" w:firstRow="1" w:lastColumn="0" w:lastRow="0" w:noHBand="0" w:noVBand="1" w:val="04A0"/>
+        <w:tblInd w:w="0" w:type="dxa"/>
+        <w:tblBorders>
+          <w:top w:val="nil" w:sz="0" w:space="0" w:color="auto"/>
+          <w:left w:val="nil" w:sz="0" w:space="0" w:color="auto"/>
+          <w:bottom w:val="nil" w:sz="0" w:space="0" w:color="auto"/>
+          <w:right w:val="nil" w:sz="0" w:space="0" w:color="auto"/>
+          <w:insideH w:val="nil" w:sz="0" w:space="0" w:color="auto"/>
+          <w:insideV w:val="nil" w:sz="0" w:space="0" w:color="auto"/>
+        </w:tblBorders>
+      </w:tblPr>
+      <w:tblGrid>
+        <w:gridCol w:w="5159"/>
+        <w:gridCol w:w="5159"/>
+      </w:tblGrid>
+      <w:tr>
+        <w:tc>
+          <w:tcPr>
+            <w:tcW w:type="dxa" w:w="5159"/>
+            <w:tcMar>
+              <w:top w:w="40" w:type="dxa"/>
+              <w:left w:w="0" w:type="dxa"/>
+              <w:bottom w:w="20" w:type="dxa"/>
+              <w:right w:w="40" w:type="dxa"/>
+            </w:tcMar>
+            <w:tcBorders>
+              <w:top w:val="nil" w:sz="0" w:space="0" w:color="auto"/>
+              <w:left w:val="nil" w:sz="0" w:space="0" w:color="auto"/>
+              <w:bottom w:val="single" w:sz="6" w:space="0" w:color="D9D2C5"/>
+              <w:right w:val="nil" w:sz="0" w:space="0" w:color="auto"/>
+            </w:tcBorders>
+          </w:tcPr>
+          <w:p>
+            <w:pPr>
+              <w:spacing w:before="0" w:after="0" w:line="220" w:lineRule="auto"/>
+              <w:jc w:val="left"/>
+            </w:pPr>
+            <w:r>
+              <w:rPr>
+                <w:rFonts w:ascii="Calibri" w:hAnsi="Calibri" w:eastAsia="Calibri"/>
+                <w:b/>
+                <w:i w:val="0"/>
+                <w:color w:val="0F2C3C"/>
+                <w:sz w:val="22"/>
+              </w:rPr>
+              <w:t>HSS ANAMANGAD — Higher Secondary Education</w:t>
+            </w:r>
+          </w:p>
+        </w:tc>
+        <w:tc>
+          <w:tcPr>
+            <w:tcW w:type="dxa" w:w="5159"/>
+            <w:tcMar>
+              <w:top w:w="40" w:type="dxa"/>
+              <w:left w:w="40" w:type="dxa"/>
+              <w:bottom w:w="20" w:type="dxa"/>
+              <w:right w:w="0" w:type="dxa"/>
+            </w:tcMar>
+            <w:tcBorders>
+              <w:top w:val="nil" w:sz="0" w:space="0" w:color="auto"/>
+              <w:left w:val="nil" w:sz="0" w:space="0" w:color="auto"/>
+              <w:bottom w:val="single" w:sz="6" w:space="0" w:color="D9D2C5"/>
+              <w:right w:val="nil" w:sz="0" w:space="0" w:color="auto"/>
+            </w:tcBorders>
+          </w:tcPr>
+          <w:p>
+            <w:pPr>
+              <w:spacing w:before="0" w:after="0" w:line="220" w:lineRule="auto"/>
+              <w:jc w:val="right"/>
+            </w:pPr>
+            <w:r>
+              <w:rPr>
+                <w:rFonts w:ascii="Calibri" w:hAnsi="Calibri" w:eastAsia="Calibri"/>
+                <w:b/>
+                <w:i w:val="0"/>
+                <w:color w:val="8A7040"/>
+                <w:sz w:val="20"/>
+              </w:rPr>
+              <w:t>2017 – 2018</w:t>
+            </w:r>
+          </w:p>
+        </w:tc>
+      </w:tr>
+    </w:tbl>
+    <w:p>
+      <w:pPr>
+        <w:spacing w:before="120" w:after="40" w:line="200" w:lineRule="auto"/>
+      </w:pPr>
+    </w:p>
+    <w:tbl>
+      <w:tblPr>
+        <w:tblW w:type="pct" w:w="5000"/>
+        <w:tblLayout w:type="autofit"/>
+        <w:tblLook w:firstColumn="1" w:firstRow="1" w:lastColumn="0" w:lastRow="0" w:noHBand="0" w:noVBand="1" w:val="04A0"/>
+        <w:tblInd w:w="0" w:type="dxa"/>
+        <w:tblBorders>
+          <w:top w:val="nil" w:sz="0" w:space="0" w:color="auto"/>
+          <w:left w:val="nil" w:sz="0" w:space="0" w:color="auto"/>
+          <w:bottom w:val="nil" w:sz="0" w:space="0" w:color="auto"/>
+          <w:right w:val="nil" w:sz="0" w:space="0" w:color="auto"/>
+          <w:insideH w:val="nil" w:sz="0" w:space="0" w:color="auto"/>
+          <w:insideV w:val="nil" w:sz="0" w:space="0" w:color="auto"/>
+        </w:tblBorders>
+      </w:tblPr>
+      <w:tblGrid>
+        <w:gridCol w:w="10318"/>
+      </w:tblGrid>
+      <w:tr>
+        <w:tc>
+          <w:tcPr>
+            <w:tcW w:type="dxa" w:w="10318"/>
+            <w:shd w:val="clear" w:color="auto" w:fill="0F2C3C"/>
+            <w:tcMar>
+              <w:top w:w="50" w:type="dxa"/>
+              <w:left w:w="120" w:type="dxa"/>
+              <w:bottom w:w="50" w:type="dxa"/>
+              <w:right w:w="80" w:type="dxa"/>
+            </w:tcMar>
+            <w:tcBorders>
+              <w:top w:val="nil" w:sz="0" w:space="0" w:color="auto"/>
+              <w:left w:val="single" w:sz="24" w:space="0" w:color="C4A35A"/>
+              <w:bottom w:val="nil" w:sz="0" w:space="0" w:color="auto"/>
+              <w:right w:val="nil" w:sz="0" w:space="0" w:color="auto"/>
+            </w:tcBorders>
+          </w:tcPr>
+          <w:p>
+            <w:pPr>
+              <w:spacing w:before="0" w:after="0" w:line="220" w:lineRule="auto"/>
+              <w:jc w:val="left"/>
+            </w:pPr>
+            <w:r>
+              <w:rPr>
+                <w:rFonts w:ascii="Calibri" w:hAnsi="Calibri" w:eastAsia="Calibri"/>
+                <w:b/>
+                <w:i w:val="0"/>
+                <w:color w:val="FFFFFF"/>
+                <w:sz w:val="20"/>
+              </w:rPr>
+              <w:t>LANGUAGES</w:t>
+            </w:r>
+          </w:p>
+        </w:tc>
+      </w:tr>
+    </w:tbl>
+    <w:p>
+      <w:pPr>
+        <w:spacing w:before="40" w:after="40" w:line="200" w:lineRule="auto"/>
+      </w:pPr>
+    </w:p>
+    <w:tbl>
+      <w:tblPr>
+        <w:tblW w:type="pct" w:w="5000"/>
+        <w:tblLayout w:type="autofit"/>
+        <w:tblLook w:firstColumn="1" w:firstRow="1" w:lastColumn="0" w:lastRow="0" w:noHBand="0" w:noVBand="1" w:val="04A0"/>
+        <w:tblInd w:w="0" w:type="dxa"/>
+        <w:tblBorders>
+          <w:top w:val="nil" w:sz="0" w:space="0" w:color="auto"/>
+          <w:left w:val="nil" w:sz="0" w:space="0" w:color="auto"/>
+          <w:bottom w:val="nil" w:sz="0" w:space="0" w:color="auto"/>
+          <w:right w:val="nil" w:sz="0" w:space="0" w:color="auto"/>
+          <w:insideH w:val="nil" w:sz="0" w:space="0" w:color="auto"/>
+          <w:insideV w:val="nil" w:sz="0" w:space="0" w:color="auto"/>
+        </w:tblBorders>
+      </w:tblPr>
+      <w:tblGrid>
+        <w:gridCol w:w="3439"/>
+        <w:gridCol w:w="3439"/>
+        <w:gridCol w:w="3439"/>
+      </w:tblGrid>
+      <w:tr>
+        <w:tc>
+          <w:tcPr>
+            <w:tcW w:type="dxa" w:w="3439"/>
+            <w:shd w:val="clear" w:color="auto" w:fill="F6F1E6"/>
+            <w:tcMar>
+              <w:top w:w="70" w:type="dxa"/>
+              <w:left w:w="40" w:type="dxa"/>
+              <w:bottom w:w="70" w:type="dxa"/>
+              <w:right w:w="40" w:type="dxa"/>
+            </w:tcMar>
+            <w:tcBorders>
+              <w:top w:val="single" w:sz="18" w:space="0" w:color="C4A35A"/>
+              <w:left w:val="nil" w:sz="0" w:space="0" w:color="auto"/>
+              <w:bottom w:val="nil" w:sz="0" w:space="0" w:color="auto"/>
+              <w:right w:val="nil" w:sz="0" w:space="0" w:color="auto"/>
+            </w:tcBorders>
+          </w:tcPr>
+          <w:p>
+            <w:pPr>
+              <w:spacing w:before="0" w:after="0" w:line="220" w:lineRule="auto"/>
+              <w:jc w:val="center"/>
+            </w:pPr>
+            <w:r>
+              <w:rPr>
+                <w:rFonts w:ascii="Calibri" w:hAnsi="Calibri" w:eastAsia="Calibri"/>
+                <w:b/>
+                <w:i w:val="0"/>
+                <w:color w:val="0F2C3C"/>
+                <w:sz w:val="22"/>
+              </w:rPr>
+              <w:t>Malayalam</w:t>
+            </w:r>
+          </w:p>
+          <w:p>
+            <w:pPr>
+              <w:spacing w:before="0" w:after="40" w:line="220" w:lineRule="auto"/>
+              <w:jc w:val="center"/>
+            </w:pPr>
+            <w:r>
+              <w:rPr>
+                <w:rFonts w:ascii="Calibri" w:hAnsi="Calibri" w:eastAsia="Calibri"/>
+                <w:b w:val="0"/>
+                <w:i w:val="0"/>
+                <w:color w:val="5A6570"/>
+                <w:sz w:val="18"/>
+              </w:rPr>
+              <w:t>Native</w:t>
+            </w:r>
+          </w:p>
+        </w:tc>
+        <w:tc>
+          <w:tcPr>
+            <w:tcW w:type="dxa" w:w="3439"/>
+            <w:shd w:val="clear" w:color="auto" w:fill="F6F1E6"/>
+            <w:tcMar>
+              <w:top w:w="70" w:type="dxa"/>
+              <w:left w:w="40" w:type="dxa"/>
+              <w:bottom w:w="70" w:type="dxa"/>
+              <w:right w:w="40" w:type="dxa"/>
+            </w:tcMar>
+            <w:tcBorders>
+              <w:top w:val="single" w:sz="18" w:space="0" w:color="C4A35A"/>
+              <w:left w:val="nil" w:sz="0" w:space="0" w:color="auto"/>
+              <w:bottom w:val="nil" w:sz="0" w:space="0" w:color="auto"/>
+              <w:right w:val="nil" w:sz="0" w:space="0" w:color="auto"/>
+            </w:tcBorders>
+          </w:tcPr>
+          <w:p>
+            <w:pPr>
+              <w:spacing w:before="0" w:after="0" w:line="220" w:lineRule="auto"/>
+              <w:jc w:val="center"/>
+            </w:pPr>
+            <w:r>
+              <w:rPr>
+                <w:rFonts w:ascii="Calibri" w:hAnsi="Calibri" w:eastAsia="Calibri"/>
+                <w:b/>
+                <w:i w:val="0"/>
+                <w:color w:val="0F2C3C"/>
+                <w:sz w:val="22"/>
+              </w:rPr>
+              <w:t>English</w:t>
+            </w:r>
+          </w:p>
+          <w:p>
+            <w:pPr>
+              <w:spacing w:before="0" w:after="40" w:line="220" w:lineRule="auto"/>
+              <w:jc w:val="center"/>
+            </w:pPr>
+            <w:r>
+              <w:rPr>
+                <w:rFonts w:ascii="Calibri" w:hAnsi="Calibri" w:eastAsia="Calibri"/>
+                <w:b w:val="0"/>
+                <w:i w:val="0"/>
+                <w:color w:val="5A6570"/>
+                <w:sz w:val="18"/>
+              </w:rPr>
+              <w:t>Fluent</w:t>
+            </w:r>
+          </w:p>
+        </w:tc>
+        <w:tc>
+          <w:tcPr>
+            <w:tcW w:type="dxa" w:w="3439"/>
+            <w:shd w:val="clear" w:color="auto" w:fill="F6F1E6"/>
+            <w:tcMar>
+              <w:top w:w="70" w:type="dxa"/>
+              <w:left w:w="40" w:type="dxa"/>
+              <w:bottom w:w="70" w:type="dxa"/>
+              <w:right w:w="40" w:type="dxa"/>
+            </w:tcMar>
+            <w:tcBorders>
+              <w:top w:val="single" w:sz="18" w:space="0" w:color="C4A35A"/>
+              <w:left w:val="nil" w:sz="0" w:space="0" w:color="auto"/>
+              <w:bottom w:val="nil" w:sz="0" w:space="0" w:color="auto"/>
+              <w:right w:val="nil" w:sz="0" w:space="0" w:color="auto"/>
+            </w:tcBorders>
+          </w:tcPr>
+          <w:p>
+            <w:pPr>
+              <w:spacing w:before="0" w:after="0" w:line="220" w:lineRule="auto"/>
+              <w:jc w:val="center"/>
+            </w:pPr>
+            <w:r>
+              <w:rPr>
+                <w:rFonts w:ascii="Calibri" w:hAnsi="Calibri" w:eastAsia="Calibri"/>
+                <w:b/>
+                <w:i w:val="0"/>
+                <w:color w:val="0F2C3C"/>
+                <w:sz w:val="22"/>
+              </w:rPr>
+              <w:t>Hindi</w:t>
+            </w:r>
+          </w:p>
+          <w:p>
+            <w:pPr>
+              <w:spacing w:before="0" w:after="40" w:line="220" w:lineRule="auto"/>
+              <w:jc w:val="center"/>
+            </w:pPr>
+            <w:r>
+              <w:rPr>
+                <w:rFonts w:ascii="Calibri" w:hAnsi="Calibri" w:eastAsia="Calibri"/>
+                <w:b w:val="0"/>
+                <w:i w:val="0"/>
+                <w:color w:val="5A6570"/>
+                <w:sz w:val="18"/>
+              </w:rPr>
+              <w:t>Basic</w:t>
+            </w:r>
+          </w:p>
+        </w:tc>
+      </w:tr>
+    </w:tbl>
+    <w:p>
+      <w:pPr>
+        <w:spacing w:before="120" w:after="40" w:line="200" w:lineRule="auto"/>
+      </w:pPr>
+    </w:p>
+    <w:tbl>
+      <w:tblPr>
+        <w:tblW w:type="pct" w:w="5000"/>
+        <w:tblLayout w:type="autofit"/>
+        <w:tblLook w:firstColumn="1" w:firstRow="1" w:lastColumn="0" w:lastRow="0" w:noHBand="0" w:noVBand="1" w:val="04A0"/>
+        <w:tblInd w:w="0" w:type="dxa"/>
+        <w:tblBorders>
+          <w:top w:val="nil" w:sz="0" w:space="0" w:color="auto"/>
+          <w:left w:val="nil" w:sz="0" w:space="0" w:color="auto"/>
+          <w:bottom w:val="nil" w:sz="0" w:space="0" w:color="auto"/>
+          <w:right w:val="nil" w:sz="0" w:space="0" w:color="auto"/>
+          <w:insideH w:val="nil" w:sz="0" w:space="0" w:color="auto"/>
+          <w:insideV w:val="nil" w:sz="0" w:space="0" w:color="auto"/>
+        </w:tblBorders>
+      </w:tblPr>
+      <w:tblGrid>
+        <w:gridCol w:w="10318"/>
+      </w:tblGrid>
+      <w:tr>
+        <w:tc>
+          <w:tcPr>
+            <w:tcW w:type="dxa" w:w="10318"/>
+            <w:shd w:val="clear" w:color="auto" w:fill="0F2C3C"/>
+            <w:tcMar>
+              <w:top w:w="50" w:type="dxa"/>
+              <w:left w:w="120" w:type="dxa"/>
+              <w:bottom w:w="50" w:type="dxa"/>
+              <w:right w:w="80" w:type="dxa"/>
+            </w:tcMar>
+            <w:tcBorders>
+              <w:top w:val="nil" w:sz="0" w:space="0" w:color="auto"/>
+              <w:left w:val="single" w:sz="24" w:space="0" w:color="C4A35A"/>
+              <w:bottom w:val="nil" w:sz="0" w:space="0" w:color="auto"/>
+              <w:right w:val="nil" w:sz="0" w:space="0" w:color="auto"/>
+            </w:tcBorders>
+          </w:tcPr>
+          <w:p>
+            <w:pPr>
+              <w:spacing w:before="0" w:after="0" w:line="220" w:lineRule="auto"/>
+              <w:jc w:val="left"/>
+            </w:pPr>
+            <w:r>
+              <w:rPr>
+                <w:rFonts w:ascii="Calibri" w:hAnsi="Calibri" w:eastAsia="Calibri"/>
+                <w:b/>
+                <w:i w:val="0"/>
+                <w:color w:val="FFFFFF"/>
+                <w:sz w:val="20"/>
+              </w:rPr>
+              <w:t>ADDITIONAL INFORMATION</w:t>
+            </w:r>
+          </w:p>
+        </w:tc>
+      </w:tr>
+    </w:tbl>
+    <w:p>
+      <w:pPr>
+        <w:spacing w:before="40" w:after="40" w:line="200" w:lineRule="auto"/>
+      </w:pPr>
     </w:p>
     <w:p>
       <w:pPr>
-        <w:tabs>
-          <w:tab w:pos="10224" w:val="right"/>
-        </w:tabs>
-        <w:spacing w:before="120" w:after="0" w:line="230" w:lineRule="auto"/>
-      </w:pPr>
-      <w:r>
-        <w:rPr>
-          <w:rFonts w:ascii="Calibri" w:hAnsi="Calibri" w:eastAsia="Calibri"/>
-          <w:b/>
-          <w:color w:val="0F2C3C"/>
-          <w:sz w:val="22"/>
-        </w:rPr>
-        <w:t>UNIVERSITY OF CALICUT  —  Bachelor of Commerce (B.Com)</w:t>
-      </w:r>
-      <w:r>
-        <w:rPr>
-          <w:rFonts w:ascii="Calibri" w:hAnsi="Calibri" w:eastAsia="Calibri"/>
-          <w:b/>
-          <w:color w:val="C4A35A"/>
-          <w:sz w:val="21"/>
-        </w:rPr>
-        <w:tab/>
-        <w:t>2019 – 2021</w:t>
-      </w:r>
-    </w:p>
-    <w:p>
-      <w:pPr>
-        <w:tabs>
-          <w:tab w:pos="10224" w:val="right"/>
-        </w:tabs>
-        <w:spacing w:before="120" w:after="0" w:line="230" w:lineRule="auto"/>
-      </w:pPr>
-      <w:r>
-        <w:rPr>
-          <w:rFonts w:ascii="Calibri" w:hAnsi="Calibri" w:eastAsia="Calibri"/>
-          <w:b/>
-          <w:color w:val="0F2C3C"/>
-          <w:sz w:val="22"/>
-        </w:rPr>
-        <w:t>HSS ANAMANGAD  —  Higher Secondary Education</w:t>
-      </w:r>
-      <w:r>
-        <w:rPr>
-          <w:rFonts w:ascii="Calibri" w:hAnsi="Calibri" w:eastAsia="Calibri"/>
-          <w:b/>
-          <w:color w:val="C4A35A"/>
-          <w:sz w:val="21"/>
-        </w:rPr>
-        <w:tab/>
-        <w:t>2017 – 2018</w:t>
-      </w:r>
-    </w:p>
-    <w:p>
-      <w:pPr>
-        <w:spacing w:before="200" w:after="120" w:line="240" w:lineRule="auto"/>
-        <w:shd w:val="clear" w:color="auto" w:fill="0F2C3C"/>
-      </w:pPr>
-      <w:r>
-        <w:rPr>
-          <w:rFonts w:ascii="Calibri" w:hAnsi="Calibri" w:eastAsia="Calibri"/>
-          <w:b/>
-          <w:color w:val="FFFFFF"/>
-          <w:sz w:val="22"/>
-        </w:rPr>
-        <w:t xml:space="preserve">  LANGUAGES  </w:t>
-      </w:r>
-    </w:p>
-    <w:p>
-      <w:pPr>
-        <w:spacing w:before="0" w:after="40" w:line="230" w:lineRule="auto"/>
+        <w:spacing w:before="40" w:after="40" w:line="220" w:lineRule="auto"/>
+        <w:jc w:val="center"/>
       </w:pPr>
       <w:r>
         <w:rPr>
           <w:rFonts w:ascii="Calibri" w:hAnsi="Calibri" w:eastAsia="Calibri"/>
           <w:b w:val="0"/>
-          <w:sz w:val="21"/>
-        </w:rPr>
-        <w:t>Malayalam — Native    |    English — Fluent    |    Hindi — Basic</w:t>
-      </w:r>
-    </w:p>
-    <w:p>
-      <w:pPr>
-        <w:spacing w:before="200" w:after="120" w:line="240" w:lineRule="auto"/>
-        <w:shd w:val="clear" w:color="auto" w:fill="0F2C3C"/>
-      </w:pPr>
-      <w:r>
-        <w:rPr>
-          <w:rFonts w:ascii="Calibri" w:hAnsi="Calibri" w:eastAsia="Calibri"/>
-          <w:b/>
-          <w:color w:val="FFFFFF"/>
-          <w:sz w:val="22"/>
-        </w:rPr>
-        <w:t xml:space="preserve">  ADDITIONAL INFORMATION  </w:t>
-      </w:r>
-    </w:p>
-    <w:p>
-      <w:pPr>
-        <w:spacing w:before="0" w:after="40" w:line="230" w:lineRule="auto"/>
-      </w:pPr>
-      <w:r>
-        <w:rPr>
-          <w:rFonts w:ascii="Calibri" w:hAnsi="Calibri" w:eastAsia="Calibri"/>
-          <w:b w:val="0"/>
-          <w:sz w:val="21"/>
+          <w:i w:val="0"/>
+          <w:color w:val="2C2C2C"/>
+          <w:sz w:val="19"/>
         </w:rPr>
         <w:t>Current Location: India  |  UAE Experience: Abu Dhabi  |  UAE Residence Visa: Valid until December 2027  |  Relocation: Available for UAE opportunities  |  Availability: Open to suitable opportunities</w:t>
       </w:r>
     </w:p>
     <w:p>
       <w:pPr>
-        <w:spacing w:before="0" w:after="40" w:line="230" w:lineRule="auto"/>
+        <w:spacing w:before="0" w:after="40" w:line="220" w:lineRule="auto"/>
+        <w:jc w:val="center"/>
       </w:pPr>
       <w:r>
         <w:rPr>
           <w:rFonts w:ascii="Calibri" w:hAnsi="Calibri" w:eastAsia="Calibri"/>
           <w:b/>
-          <w:sz w:val="21"/>
+          <w:i w:val="0"/>
+          <w:color w:val="2C2C2C"/>
+          <w:sz w:val="19"/>
         </w:rPr>
         <w:t xml:space="preserve">Target Roles: </w:t>
       </w:r>
@@ -920,19 +2116,84 @@
         <w:rPr>
           <w:rFonts w:ascii="Calibri" w:hAnsi="Calibri" w:eastAsia="Calibri"/>
           <w:b w:val="0"/>
-          <w:sz w:val="21"/>
+          <w:i w:val="0"/>
+          <w:color w:val="2C2C2C"/>
+          <w:sz w:val="19"/>
         </w:rPr>
         <w:t>Accounting | Finance | Procurement | Purchasing | Operations | Project Coordination | Administration | Business Support</w:t>
       </w:r>
     </w:p>
     <w:sectPr>
-      <w:pgSz w:w="12240" w:h="15840"/>
-      <w:pgMar w:top="720" w:right="936" w:bottom="720" w:left="936" w:header="720" w:footer="720" w:gutter="0"/>
+      <w:footerReference w:type="default" r:id="rId9"/>
+      <w:pgSz w:w="11906" w:h="16838"/>
+      <w:pgMar w:top="567" w:right="794" w:bottom="794" w:left="794" w:header="720" w:footer="720" w:gutter="0"/>
       <w:cols w:space="720"/>
       <w:docGrid w:linePitch="360"/>
     </w:sectPr>
   </w:body>
 </w:document>
+</file>
+
+<file path=word/footer1.xml><?xml version="1.0" encoding="utf-8"?>
+<w:ftr xmlns:m="http://schemas.openxmlformats.org/officeDocument/2006/math" xmlns:mc="http://schemas.openxmlformats.org/markup-compatibility/2006" xmlns:mo="http://schemas.microsoft.com/office/mac/office/2008/main" xmlns:mv="urn:schemas-microsoft-com:mac:vml" xmlns:o="urn:schemas-microsoft-com:office:office" xmlns:r="http://schemas.openxmlformats.org/officeDocument/2006/relationships" xmlns:v="urn:schemas-microsoft-com:vml" xmlns:w10="urn:schemas-microsoft-com:office:word" xmlns:w14="http://schemas.microsoft.com/office/word/2010/wordml" xmlns:w="http://schemas.openxmlformats.org/wordprocessingml/2006/main" xmlns:wne="http://schemas.microsoft.com/office/word/2006/wordml" xmlns:wp14="http://schemas.microsoft.com/office/word/2010/wordprocessingDrawing" xmlns:wp="http://schemas.openxmlformats.org/drawingml/2006/wordprocessingDrawing" xmlns:wpc="http://schemas.microsoft.com/office/word/2010/wordprocessingCanvas" xmlns:wpg="http://schemas.microsoft.com/office/word/2010/wordprocessingGroup" xmlns:wpi="http://schemas.microsoft.com/office/word/2010/wordprocessingInk" xmlns:wps="http://schemas.microsoft.com/office/word/2010/wordprocessingShape" mc:Ignorable="w14 wp14">
+  <w:p>
+    <w:pPr>
+      <w:pStyle w:val="Footer"/>
+      <w:tabs>
+        <w:tab w:pos="9751" w:val="right"/>
+      </w:tabs>
+      <w:spacing w:before="80" w:after="0" w:line="200" w:lineRule="auto"/>
+      <w:jc w:val="left"/>
+      <w:shd w:val="clear" w:color="auto" w:fill="0F2C3C"/>
+    </w:pPr>
+    <w:r>
+      <w:rPr>
+        <w:rFonts w:ascii="Calibri" w:hAnsi="Calibri" w:eastAsia="Calibri"/>
+        <w:b w:val="0"/>
+        <w:i w:val="0"/>
+        <w:color w:val="FFFFFF"/>
+        <w:sz w:val="16"/>
+      </w:rPr>
+      <w:t xml:space="preserve">  Mohammed Jaseer  |  Curriculum Vitae</w:t>
+    </w:r>
+    <w:r>
+      <w:rPr>
+        <w:rFonts w:ascii="Calibri" w:hAnsi="Calibri" w:eastAsia="Calibri"/>
+        <w:b w:val="0"/>
+        <w:i w:val="0"/>
+        <w:color w:val="FFFFFF"/>
+        <w:sz w:val="16"/>
+      </w:rPr>
+      <w:tab/>
+    </w:r>
+    <w:r>
+      <w:rPr>
+        <w:rFonts w:ascii="Calibri" w:hAnsi="Calibri" w:eastAsia="Calibri"/>
+        <w:b w:val="0"/>
+        <w:i w:val="0"/>
+        <w:color w:val="FFFFFF"/>
+        <w:sz w:val="16"/>
+      </w:rPr>
+      <w:t xml:space="preserve">Page </w:t>
+    </w:r>
+    <w:r>
+      <w:fldChar w:fldCharType="begin"/>
+    </w:r>
+    <w:r>
+      <w:rPr>
+        <w:rFonts w:ascii="Calibri" w:hAnsi="Calibri" w:eastAsia="Calibri"/>
+        <w:b w:val="0"/>
+        <w:i w:val="0"/>
+        <w:color w:val="FFFFFF"/>
+        <w:sz w:val="16"/>
+      </w:rPr>
+      <w:instrText xml:space="preserve"> PAGE </w:instrText>
+    </w:r>
+    <w:r>
+      <w:fldChar w:fldCharType="end"/>
+    </w:r>
+  </w:p>
+</w:ftr>
 </file>
 
 <file path=word/numbering.xml><?xml version="1.0" encoding="utf-8"?>
@@ -1301,7 +2562,7 @@
     <w:rPr>
       <w:rFonts w:ascii="Calibri" w:hAnsi="Calibri"/>
       <w:color w:val="2C2C2C"/>
-      <w:sz w:val="21"/>
+      <w:sz w:val="20"/>
     </w:rPr>
   </w:style>
   <w:style w:type="paragraph" w:styleId="Header">

</xml_diff>